<commit_message>
Psicología Evolutiva: C23 con las diapositivas; simulacro y cuadro integradores
Cursada y ficha de repaso de C23 rehechas con la presentación de la
cátedra (suman eutanasia, cuidados paliativos, educación para la muerte y
caída terminal; sale el estudio CLOC), mazo de flashcards actualizado
conservando las claves de Anki, simulacro integrador C17-23 ajustado
(A3, A7, B4, C4, D3, E1) y cuadro «Pérdidas y ganancias» con C21-C23
según las diapositivas.

Co-Authored-By: Claude Sonnet 5.5 <noreply@anthropic.com>
</commit_message>
<xml_diff>
--- a/2do Año/Psicología Evolutiva/3_Guias_de_Estudio/C23_MuerteYDuelo_Cursada_Guia.docx
+++ b/2do Año/Psicología Evolutiva/3_Guias_de_Estudio/C23_MuerteYDuelo_Cursada_Guia.docx
@@ -2,13 +2,13 @@
 <file path=word/document.xml><?xml version="1.0" encoding="utf-8"?>
 <w:document xmlns:w="http://schemas.openxmlformats.org/wordprocessingml/2006/main" xmlns:m="http://schemas.openxmlformats.org/officeDocument/2006/math" xmlns:r="http://schemas.openxmlformats.org/officeDocument/2006/relationships" xmlns:o="urn:schemas-microsoft-com:office:office" xmlns:v="urn:schemas-microsoft-com:vml" xmlns:w10="urn:schemas-microsoft-com:office:word" xmlns:a="http://schemas.openxmlformats.org/drawingml/2006/main" xmlns:pic="http://schemas.openxmlformats.org/drawingml/2006/picture" xmlns:wp="http://schemas.openxmlformats.org/drawingml/2006/wordprocessingDrawing">
   <w:body>
-    <w:bookmarkStart w:id="16" w:name="c23-muerte-y-duelo-versión-de-cursada"/>
+    <w:bookmarkStart w:id="20" w:name="X716a9bb12d5142449daa10d2c7c590abfaba7b5"/>
     <w:p>
       <w:pPr>
         <w:pStyle w:val="Heading1"/>
       </w:pPr>
       <w:r>
-        <w:t xml:space="preserve">C23 — Muerte y duelo · Versión de cursada</w:t>
+        <w:t xml:space="preserve">C23 — Actitudes y creencias frente a la muerte · Versión de cursada</w:t>
       </w:r>
     </w:p>
     <w:p>
@@ -28,7 +28,7 @@
         <w:pStyle w:val="RecuadroFuente"/>
       </w:pPr>
       <w:r>
-        <w:t xml:space="preserve">• Papalia, D. E., Sterns, H. L., Feldman, R. D., &amp; Camp, C. J. (2009b). Lidiar con la muerte y las pérdidas. En</w:t>
+        <w:t xml:space="preserve">• Cátedra de Psicología Evolutiva. (2026i).</w:t>
       </w:r>
       <w:r>
         <w:t xml:space="preserve"> </w:t>
@@ -38,6 +38,30 @@
           <w:i/>
           <w:iCs/>
         </w:rPr>
+        <w:t xml:space="preserve">Actitudes y creencias frente a la muerte</w:t>
+      </w:r>
+      <w:r>
+        <w:t xml:space="preserve"> </w:t>
+      </w:r>
+      <w:r>
+        <w:t xml:space="preserve">[Diapositivas de clase, unidad 10]. Universidad Favaloro.</w:t>
+      </w:r>
+    </w:p>
+    <w:p>
+      <w:pPr>
+        <w:pStyle w:val="RecuadroFuente"/>
+      </w:pPr>
+      <w:r>
+        <w:t xml:space="preserve">• Papalia, D. E., Sterns, H. L., Feldman, R. D., &amp; Camp, C. J. (2009b). Lidiar con la muerte y las pérdidas. En</w:t>
+      </w:r>
+      <w:r>
+        <w:t xml:space="preserve"> </w:t>
+      </w:r>
+      <w:r>
+        <w:rPr>
+          <w:i/>
+          <w:iCs/>
+        </w:rPr>
         <w:t xml:space="preserve">Desarrollo del adulto y vejez</w:t>
       </w:r>
       <w:r>
@@ -62,12 +86,6 @@
         <w:t xml:space="preserve"> </w:t>
       </w:r>
       <w:r>
-        <w:t xml:space="preserve">esta es la</w:t>
-      </w:r>
-      <w:r>
-        <w:t xml:space="preserve"> </w:t>
-      </w:r>
-      <w:r>
         <w:rPr>
           <w:b/>
           <w:bCs/>
@@ -75,20 +93,71 @@
         <w:t xml:space="preserve">versión de cursada</w:t>
       </w:r>
       <w:r>
-        <w:t xml:space="preserve">, pero la clase (27/10)</w:t>
-      </w:r>
-      <w:r>
-        <w:t xml:space="preserve"> </w:t>
-      </w:r>
-      <w:r>
-        <w:rPr>
-          <w:b/>
-          <w:bCs/>
-        </w:rPr>
-        <w:t xml:space="preserve">todavía no se dictó</w:t>
-      </w:r>
-      <w:r>
-        <w:t xml:space="preserve">: no hay diapositivas ni apuntes, así que el recorte sigue solo el programa de la unidad 10: «proceso de aceptación de la propia muerte; cambios en las perspectivas sobre la muerte; actitudes hacia la muerte; proceso de duelo». Cuando tengas la presentación, ajustá el énfasis. Quedan afuera, y están en</w:t>
+        <w:t xml:space="preserve"> </w:t>
+      </w:r>
+      <w:r>
+        <w:t xml:space="preserve">(protocolo A): lo que se dio en la clase del 27/10 (diapositivas de la cátedra) y lo que pide el programa de la unidad 10 («proceso de aceptación de la propia muerte; cambios en las perspectivas sobre la muerte; actitudes hacia la muerte; proceso de duelo»). Sigue el orden de las diapositivas y reemplaza a la versión provisoria anterior, hecha solo con el programa.</w:t>
+      </w:r>
+      <w:r>
+        <w:t xml:space="preserve"> </w:t>
+      </w:r>
+      <w:r>
+        <w:rPr>
+          <w:b/>
+          <w:bCs/>
+        </w:rPr>
+        <w:t xml:space="preserve">Cambio importante:</w:t>
+      </w:r>
+      <w:r>
+        <w:t xml:space="preserve"> </w:t>
+      </w:r>
+      <w:r>
+        <w:t xml:space="preserve">la</w:t>
+      </w:r>
+      <w:r>
+        <w:t xml:space="preserve"> </w:t>
+      </w:r>
+      <w:r>
+        <w:rPr>
+          <w:b/>
+          <w:bCs/>
+        </w:rPr>
+        <w:t xml:space="preserve">eutanasia</w:t>
+      </w:r>
+      <w:r>
+        <w:t xml:space="preserve"> </w:t>
+      </w:r>
+      <w:r>
+        <w:t xml:space="preserve">y los</w:t>
+      </w:r>
+      <w:r>
+        <w:t xml:space="preserve"> </w:t>
+      </w:r>
+      <w:r>
+        <w:rPr>
+          <w:b/>
+          <w:bCs/>
+        </w:rPr>
+        <w:t xml:space="preserve">cuidados paliativos</w:t>
+      </w:r>
+      <w:r>
+        <w:t xml:space="preserve">, que antes quedaron afuera por no figurar en el programa,</w:t>
+      </w:r>
+      <w:r>
+        <w:t xml:space="preserve"> </w:t>
+      </w:r>
+      <w:r>
+        <w:rPr>
+          <w:b/>
+          <w:bCs/>
+        </w:rPr>
+        <w:t xml:space="preserve">sí se dieron en clase</w:t>
+      </w:r>
+      <w:r>
+        <w:t xml:space="preserve"> </w:t>
+      </w:r>
+      <w:r>
+        <w:t xml:space="preserve">y entran. Quedan afuera, y están en</w:t>
       </w:r>
       <w:r>
         <w:t xml:space="preserve"> </w:t>
@@ -100,23 +169,7 @@
         <w:t xml:space="preserve">C23_MuerteYDuelo_Guia.md</w:t>
       </w:r>
       <w:r>
-        <w:t xml:space="preserve">:</w:t>
-      </w:r>
-      <w:r>
-        <w:t xml:space="preserve"> </w:t>
-      </w:r>
-      <w:r>
-        <w:rPr>
-          <w:b/>
-          <w:bCs/>
-        </w:rPr>
-        <w:t xml:space="preserve">suicidio, eutanasia y suicidio asistido</w:t>
-      </w:r>
-      <w:r>
-        <w:t xml:space="preserve"> </w:t>
-      </w:r>
-      <w:r>
-        <w:t xml:space="preserve">(no figuran en el programa), la caída terminal, la pérdida de un padre o un hijo y el duelo por aborto en detalle, y las cifras de EE. UU.</w:t>
+        <w:t xml:space="preserve">: el estudio CLOC, los patrones de Wortman y Silver, la pérdida ambigua, la viudez y la pérdida de un padre o un hijo, el duelo por aborto, el suicidio y el detalle de las leyes y encuestas de EE. UU. Algunas diapositivas (la 16, la 20) tienen parte de su contenido como imagen sin texto; esas partes se completaron con el libro y se indica.</w:t>
       </w:r>
     </w:p>
     <w:p>
@@ -134,7 +187,23 @@
         <w:t xml:space="preserve"> </w:t>
       </w:r>
       <w:r>
-        <w:t xml:space="preserve">La muerte tiene tres aspectos —</w:t>
+        <w:t xml:space="preserve">Las actitudes ante la muerte se modelan con el</w:t>
+      </w:r>
+      <w:r>
+        <w:t xml:space="preserve"> </w:t>
+      </w:r>
+      <w:r>
+        <w:rPr>
+          <w:b/>
+          <w:bCs/>
+        </w:rPr>
+        <w:t xml:space="preserve">tiempo, el contexto y la cultura</w:t>
+      </w:r>
+      <w:r>
+        <w:t xml:space="preserve">, y cambian con la edad: los adultos jóvenes evitan pensarla, en la adultez media se toma conciencia de que se va a morir y los ancianos están menos ansiosos. La muerte tiene aspectos</w:t>
+      </w:r>
+      <w:r>
+        <w:t xml:space="preserve"> </w:t>
       </w:r>
       <w:r>
         <w:rPr>
@@ -144,49 +213,33 @@
         <w:t xml:space="preserve">biológico, social y psicológico</w:t>
       </w:r>
       <w:r>
-        <w:t xml:space="preserve">— y su significado depende de la cultura y de la época: hoy se la tiende a</w:t>
-      </w:r>
-      <w:r>
-        <w:t xml:space="preserve"> </w:t>
-      </w:r>
-      <w:r>
-        <w:rPr>
-          <w:b/>
-          <w:bCs/>
-        </w:rPr>
-        <w:t xml:space="preserve">negar</w:t>
-      </w:r>
-      <w:r>
-        <w:t xml:space="preserve">, pero resurge el interés por afrontarla. Las actitudes cambian con la edad.</w:t>
-      </w:r>
-      <w:r>
-        <w:t xml:space="preserve"> </w:t>
-      </w:r>
-      <w:r>
-        <w:rPr>
-          <w:b/>
-          <w:bCs/>
-        </w:rPr>
-        <w:t xml:space="preserve">Kübler-Ross</w:t>
-      </w:r>
-      <w:r>
-        <w:t xml:space="preserve"> </w:t>
-      </w:r>
-      <w:r>
-        <w:t xml:space="preserve">describió cinco reacciones ante la muerte cercana, que</w:t>
-      </w:r>
-      <w:r>
-        <w:t xml:space="preserve"> </w:t>
-      </w:r>
-      <w:r>
-        <w:rPr>
-          <w:b/>
-          <w:bCs/>
-        </w:rPr>
-        <w:t xml:space="preserve">no son etapas universales</w:t>
-      </w:r>
-      <w:r>
-        <w:t xml:space="preserve">. El</w:t>
+        <w:t xml:space="preserve">; los</w:t>
+      </w:r>
+      <w:r>
+        <w:t xml:space="preserve"> </w:t>
+      </w:r>
+      <w:r>
+        <w:rPr>
+          <w:b/>
+          <w:bCs/>
+        </w:rPr>
+        <w:t xml:space="preserve">rituales</w:t>
+      </w:r>
+      <w:r>
+        <w:t xml:space="preserve"> </w:t>
+      </w:r>
+      <w:r>
+        <w:t xml:space="preserve">ayudan a afrontar la pérdida. Hay cambios psicológicos antes de morir (</w:t>
+      </w:r>
+      <w:r>
+        <w:rPr>
+          <w:b/>
+          <w:bCs/>
+        </w:rPr>
+        <w:t xml:space="preserve">caída terminal</w:t>
+      </w:r>
+      <w:r>
+        <w:t xml:space="preserve">). Se estudian las reacciones ante la muerte cercana (Kübler-Ross) y el</w:t>
       </w:r>
       <w:r>
         <w:t xml:space="preserve"> </w:t>
@@ -199,32 +252,61 @@
         <w:t xml:space="preserve">duelo</w:t>
       </w:r>
       <w:r>
-        <w:t xml:space="preserve"> </w:t>
-      </w:r>
-      <w:r>
-        <w:t xml:space="preserve">no sigue un único patrón: lo más frecuente en los viudos mayores es la</w:t>
-      </w:r>
-      <w:r>
-        <w:t xml:space="preserve"> </w:t>
-      </w:r>
-      <w:r>
-        <w:rPr>
-          <w:b/>
-          <w:bCs/>
-        </w:rPr>
-        <w:t xml:space="preserve">resiliencia</w:t>
-      </w:r>
-      <w:r>
-        <w:t xml:space="preserve">. Encontrar sentido a la vida reduce el miedo a morir (Papalia et al., 2009b, pp. 478-487, 495-496, 517-519).</w:t>
-      </w:r>
-    </w:p>
-    <w:bookmarkStart w:id="9" w:name="mapa-qué-pide-el-programa"/>
+        <w:t xml:space="preserve">, que no es tan universal como se cree. La</w:t>
+      </w:r>
+      <w:r>
+        <w:t xml:space="preserve"> </w:t>
+      </w:r>
+      <w:r>
+        <w:rPr>
+          <w:b/>
+          <w:bCs/>
+        </w:rPr>
+        <w:t xml:space="preserve">educación para la muerte</w:t>
+      </w:r>
+      <w:r>
+        <w:t xml:space="preserve">, los</w:t>
+      </w:r>
+      <w:r>
+        <w:t xml:space="preserve"> </w:t>
+      </w:r>
+      <w:r>
+        <w:rPr>
+          <w:b/>
+          <w:bCs/>
+        </w:rPr>
+        <w:t xml:space="preserve">cuidados paliativos</w:t>
+      </w:r>
+      <w:r>
+        <w:t xml:space="preserve"> </w:t>
+      </w:r>
+      <w:r>
+        <w:t xml:space="preserve">y el debate sobre la</w:t>
+      </w:r>
+      <w:r>
+        <w:t xml:space="preserve"> </w:t>
+      </w:r>
+      <w:r>
+        <w:rPr>
+          <w:b/>
+          <w:bCs/>
+        </w:rPr>
+        <w:t xml:space="preserve">eutanasia</w:t>
+      </w:r>
+      <w:r>
+        <w:t xml:space="preserve"> </w:t>
+      </w:r>
+      <w:r>
+        <w:t xml:space="preserve">completan la clase (Cátedra de Psicología Evolutiva, 2026i, diapositivas 3, 5-8, 10-12, 15-17, 19-24; Papalia et al., 2009b, pp. 478-487).</w:t>
+      </w:r>
+    </w:p>
+    <w:bookmarkStart w:id="9" w:name="Xbf34893e62caa72360cd6958f62a991b59550e5"/>
     <w:p>
       <w:pPr>
         <w:pStyle w:val="Heading2"/>
       </w:pPr>
       <w:r>
-        <w:t xml:space="preserve">Mapa: qué pide el programa</w:t>
+        <w:t xml:space="preserve">Mapa: qué pide el programa y qué se dio en clase</w:t>
       </w:r>
     </w:p>
     <w:tbl>
@@ -302,7 +384,7 @@
               <w:jc w:val="left"/>
             </w:pPr>
             <w:r>
-              <w:t xml:space="preserve">Cambios en las perspectivas sobre la muerte</w:t>
+              <w:t xml:space="preserve">La idea de la muerte; cambios en las perspectivas</w:t>
             </w:r>
           </w:p>
         </w:tc>
@@ -326,7 +408,7 @@
               <w:jc w:val="left"/>
             </w:pPr>
             <w:r>
-              <w:t xml:space="preserve">sin datos</w:t>
+              <w:t xml:space="preserve">✔</w:t>
             </w:r>
           </w:p>
         </w:tc>
@@ -376,7 +458,7 @@
               <w:jc w:val="left"/>
             </w:pPr>
             <w:r>
-              <w:t xml:space="preserve">sin datos</w:t>
+              <w:t xml:space="preserve">✔</w:t>
             </w:r>
           </w:p>
         </w:tc>
@@ -402,7 +484,19 @@
               <w:jc w:val="left"/>
             </w:pPr>
             <w:r>
-              <w:t xml:space="preserve">Proceso de aceptación de la propia muerte: Kübler-Ross, revisión de vida</w:t>
+              <w:t xml:space="preserve">Aspectos de la muerte: biológico, social, psicológico; rituales</w:t>
+            </w:r>
+          </w:p>
+        </w:tc>
+        <w:tc>
+          <w:tcPr/>
+          <w:p>
+            <w:pPr>
+              <w:pStyle w:val="Compact"/>
+              <w:jc w:val="left"/>
+            </w:pPr>
+            <w:r>
+              <w:t xml:space="preserve">—</w:t>
             </w:r>
           </w:p>
         </w:tc>
@@ -415,18 +509,6 @@
             </w:pPr>
             <w:r>
               <w:t xml:space="preserve">✔</w:t>
-            </w:r>
-          </w:p>
-        </w:tc>
-        <w:tc>
-          <w:tcPr/>
-          <w:p>
-            <w:pPr>
-              <w:pStyle w:val="Compact"/>
-              <w:jc w:val="left"/>
-            </w:pPr>
-            <w:r>
-              <w:t xml:space="preserve">sin datos</w:t>
             </w:r>
           </w:p>
         </w:tc>
@@ -452,7 +534,19 @@
               <w:jc w:val="left"/>
             </w:pPr>
             <w:r>
-              <w:t xml:space="preserve">Proceso de duelo: duelo, pena, luto; patrones; viudez</w:t>
+              <w:t xml:space="preserve">Caída terminal</w:t>
+            </w:r>
+          </w:p>
+        </w:tc>
+        <w:tc>
+          <w:tcPr/>
+          <w:p>
+            <w:pPr>
+              <w:pStyle w:val="Compact"/>
+              <w:jc w:val="left"/>
+            </w:pPr>
+            <w:r>
+              <w:t xml:space="preserve">—</w:t>
             </w:r>
           </w:p>
         </w:tc>
@@ -476,7 +570,21 @@
               <w:jc w:val="left"/>
             </w:pPr>
             <w:r>
-              <w:t xml:space="preserve">sin datos</w:t>
+              <w:t xml:space="preserve">§4</w:t>
+            </w:r>
+          </w:p>
+        </w:tc>
+      </w:tr>
+      <w:tr>
+        <w:tc>
+          <w:tcPr/>
+          <w:p>
+            <w:pPr>
+              <w:pStyle w:val="Compact"/>
+              <w:jc w:val="left"/>
+            </w:pPr>
+            <w:r>
+              <w:t xml:space="preserve">Educación para la muerte</w:t>
             </w:r>
           </w:p>
         </w:tc>
@@ -488,7 +596,181 @@
               <w:jc w:val="left"/>
             </w:pPr>
             <w:r>
-              <w:t xml:space="preserve">§4</w:t>
+              <w:t xml:space="preserve">—</w:t>
+            </w:r>
+          </w:p>
+        </w:tc>
+        <w:tc>
+          <w:tcPr/>
+          <w:p>
+            <w:pPr>
+              <w:pStyle w:val="Compact"/>
+              <w:jc w:val="left"/>
+            </w:pPr>
+            <w:r>
+              <w:t xml:space="preserve">✔</w:t>
+            </w:r>
+          </w:p>
+        </w:tc>
+        <w:tc>
+          <w:tcPr/>
+          <w:p>
+            <w:pPr>
+              <w:pStyle w:val="Compact"/>
+              <w:jc w:val="left"/>
+            </w:pPr>
+            <w:r>
+              <w:t xml:space="preserve">§5</w:t>
+            </w:r>
+          </w:p>
+        </w:tc>
+      </w:tr>
+      <w:tr>
+        <w:tc>
+          <w:tcPr/>
+          <w:p>
+            <w:pPr>
+              <w:pStyle w:val="Compact"/>
+              <w:jc w:val="left"/>
+            </w:pPr>
+            <w:r>
+              <w:t xml:space="preserve">Proceso de aceptación de la propia muerte; proceso de duelo; mitos</w:t>
+            </w:r>
+          </w:p>
+        </w:tc>
+        <w:tc>
+          <w:tcPr/>
+          <w:p>
+            <w:pPr>
+              <w:pStyle w:val="Compact"/>
+              <w:jc w:val="left"/>
+            </w:pPr>
+            <w:r>
+              <w:t xml:space="preserve">✔</w:t>
+            </w:r>
+          </w:p>
+        </w:tc>
+        <w:tc>
+          <w:tcPr/>
+          <w:p>
+            <w:pPr>
+              <w:pStyle w:val="Compact"/>
+              <w:jc w:val="left"/>
+            </w:pPr>
+            <w:r>
+              <w:t xml:space="preserve">✔</w:t>
+            </w:r>
+          </w:p>
+        </w:tc>
+        <w:tc>
+          <w:tcPr/>
+          <w:p>
+            <w:pPr>
+              <w:pStyle w:val="Compact"/>
+              <w:jc w:val="left"/>
+            </w:pPr>
+            <w:r>
+              <w:t xml:space="preserve">§6</w:t>
+            </w:r>
+          </w:p>
+        </w:tc>
+      </w:tr>
+      <w:tr>
+        <w:tc>
+          <w:tcPr/>
+          <w:p>
+            <w:pPr>
+              <w:pStyle w:val="Compact"/>
+              <w:jc w:val="left"/>
+            </w:pPr>
+            <w:r>
+              <w:t xml:space="preserve">Cuidados paliativos y dignidad</w:t>
+            </w:r>
+          </w:p>
+        </w:tc>
+        <w:tc>
+          <w:tcPr/>
+          <w:p>
+            <w:pPr>
+              <w:pStyle w:val="Compact"/>
+              <w:jc w:val="left"/>
+            </w:pPr>
+            <w:r>
+              <w:t xml:space="preserve">—</w:t>
+            </w:r>
+          </w:p>
+        </w:tc>
+        <w:tc>
+          <w:tcPr/>
+          <w:p>
+            <w:pPr>
+              <w:pStyle w:val="Compact"/>
+              <w:jc w:val="left"/>
+            </w:pPr>
+            <w:r>
+              <w:t xml:space="preserve">✔</w:t>
+            </w:r>
+          </w:p>
+        </w:tc>
+        <w:tc>
+          <w:tcPr/>
+          <w:p>
+            <w:pPr>
+              <w:pStyle w:val="Compact"/>
+              <w:jc w:val="left"/>
+            </w:pPr>
+            <w:r>
+              <w:t xml:space="preserve">§7</w:t>
+            </w:r>
+          </w:p>
+        </w:tc>
+      </w:tr>
+      <w:tr>
+        <w:tc>
+          <w:tcPr/>
+          <w:p>
+            <w:pPr>
+              <w:pStyle w:val="Compact"/>
+              <w:jc w:val="left"/>
+            </w:pPr>
+            <w:r>
+              <w:t xml:space="preserve">Eutanasia</w:t>
+            </w:r>
+          </w:p>
+        </w:tc>
+        <w:tc>
+          <w:tcPr/>
+          <w:p>
+            <w:pPr>
+              <w:pStyle w:val="Compact"/>
+              <w:jc w:val="left"/>
+            </w:pPr>
+            <w:r>
+              <w:t xml:space="preserve">—</w:t>
+            </w:r>
+          </w:p>
+        </w:tc>
+        <w:tc>
+          <w:tcPr/>
+          <w:p>
+            <w:pPr>
+              <w:pStyle w:val="Compact"/>
+              <w:jc w:val="left"/>
+            </w:pPr>
+            <w:r>
+              <w:t xml:space="preserve">✔</w:t>
+            </w:r>
+          </w:p>
+        </w:tc>
+        <w:tc>
+          <w:tcPr/>
+          <w:p>
+            <w:pPr>
+              <w:pStyle w:val="Compact"/>
+              <w:jc w:val="left"/>
+            </w:pPr>
+            <w:r>
+              <w:t xml:space="preserve">§8</w:t>
             </w:r>
           </w:p>
         </w:tc>
@@ -502,13 +784,13 @@
       </w:r>
     </w:p>
     <w:bookmarkEnd w:id="9"/>
-    <w:bookmarkStart w:id="10" w:name="X28857ffbd6d94ba7f4f6b08fb1e6ff9a5cbc2da"/>
+    <w:bookmarkStart w:id="10" w:name="la-idea-de-la-muerte"/>
     <w:p>
       <w:pPr>
         <w:pStyle w:val="Heading2"/>
       </w:pPr>
       <w:r>
-        <w:t xml:space="preserve">1. Cambios en las perspectivas sobre la muerte</w:t>
+        <w:t xml:space="preserve">1. La idea de la muerte</w:t>
       </w:r>
     </w:p>
     <w:p>
@@ -516,43 +798,20 @@
         <w:pStyle w:val="FirstParagraph"/>
       </w:pPr>
       <w:r>
-        <w:rPr>
-          <w:b/>
-          <w:bCs/>
-        </w:rPr>
-        <w:t xml:space="preserve">La «revolución en la mortalidad».</w:t>
-      </w:r>
-      <w:r>
-        <w:t xml:space="preserve"> </w:t>
-      </w:r>
-      <w:r>
-        <w:t xml:space="preserve">Antes de los tiempos modernos la muerte era cotidiana: más de un tercio de los bebés moría en la infancia y se esperaba que algunos hijos murieran jóvenes. Los avances médicos y sanitarios hicieron que hoy casi</w:t>
-      </w:r>
-      <w:r>
-        <w:t xml:space="preserve"> </w:t>
-      </w:r>
-      <w:r>
-        <w:rPr>
-          <w:b/>
-          <w:bCs/>
-        </w:rPr>
-        <w:t xml:space="preserve">tres cuartas partes</w:t>
-      </w:r>
-      <w:r>
-        <w:t xml:space="preserve"> </w:t>
-      </w:r>
-      <w:r>
-        <w:t xml:space="preserve">de las muertes en EE. UU. ocurran después de los 65. La muerte se volvió «</w:t>
-      </w:r>
-      <w:r>
-        <w:rPr>
-          <w:b/>
-          <w:bCs/>
-        </w:rPr>
-        <w:t xml:space="preserve">invisible y abstracta</w:t>
-      </w:r>
-      <w:r>
-        <w:t xml:space="preserve">»: el cuidado del moribundo pasó de la familia a los profesionales, y más de dos de cada tres muertes ocurrían fuera del hogar (Papalia et al., 2009b, pp. 478-479). El caso de</w:t>
+        <w:t xml:space="preserve">Las actitudes de las personas ante la muerte se modelan con</w:t>
+      </w:r>
+      <w:r>
+        <w:t xml:space="preserve"> </w:t>
+      </w:r>
+      <w:r>
+        <w:rPr>
+          <w:b/>
+          <w:bCs/>
+        </w:rPr>
+        <w:t xml:space="preserve">el tiempo, el contexto y cómo lidian con ella en su cultura</w:t>
+      </w:r>
+      <w:r>
+        <w:t xml:space="preserve">. En la antigüedad la muerte era más frecuente; los</w:t>
       </w:r>
       <w:r>
         <w:t xml:space="preserve"> </w:t>
@@ -562,13 +821,29 @@
           <w:i/>
           <w:iCs/>
         </w:rPr>
-        <w:t xml:space="preserve">Mujercitas</w:t>
-      </w:r>
-      <w:r>
-        <w:t xml:space="preserve"> </w:t>
-      </w:r>
-      <w:r>
-        <w:t xml:space="preserve">(Louisa May Alcott, que cuidó a su hermana moribunda en casa) muestra el modelo anterior.</w:t>
+        <w:t xml:space="preserve">baby boomers</w:t>
+      </w:r>
+      <w:r>
+        <w:t xml:space="preserve"> </w:t>
+      </w:r>
+      <w:r>
+        <w:t xml:space="preserve">fueron la</w:t>
+      </w:r>
+      <w:r>
+        <w:t xml:space="preserve"> </w:t>
+      </w:r>
+      <w:r>
+        <w:rPr>
+          <w:b/>
+          <w:bCs/>
+        </w:rPr>
+        <w:t xml:space="preserve">primera generación en llegar a la adultez con solo un 5 % de probabilidad</w:t>
+      </w:r>
+      <w:r>
+        <w:t xml:space="preserve"> </w:t>
+      </w:r>
+      <w:r>
+        <w:t xml:space="preserve">de haber vivido la muerte de un familiar inmediato (Cátedra de Psicología Evolutiva, 2026i, diapositiva 3; Papalia et al., 2009b, pp. 478-479). Detrás está la «revolución en la mortalidad»: los avances médicos y sanitarios hicieron que hoy la mayoría de las muertes ocurran en edades avanzadas y que la muerte se haya vuelto «invisible y abstracta» (pp. 478-479).</w:t>
       </w:r>
     </w:p>
     <w:p>
@@ -576,17 +851,32 @@
         <w:pStyle w:val="BodyText"/>
       </w:pPr>
       <w:r>
-        <w:rPr>
-          <w:b/>
-          <w:bCs/>
-        </w:rPr>
-        <w:t xml:space="preserve">Tres aspectos de la muerte</w:t>
-      </w:r>
-      <w:r>
-        <w:t xml:space="preserve"> </w:t>
-      </w:r>
-      <w:r>
-        <w:t xml:space="preserve">(pp. 479-481):</w:t>
+        <w:t xml:space="preserve">La clase abre con dos preguntas para pensar: ¿qué significa la muerte para ustedes? y ¿cómo lidian con ella? (diapositiva 4). No tienen respuesta única: son para articular con los conceptos de abajo.</w:t>
+      </w:r>
+    </w:p>
+    <w:p>
+      <w:r>
+        <w:pict>
+          <v:rect style="width:0;height:1.5pt" o:hralign="center" o:hrstd="t" o:hr="t"/>
+        </w:pict>
+      </w:r>
+    </w:p>
+    <w:bookmarkEnd w:id="10"/>
+    <w:bookmarkStart w:id="11" w:name="actitudes-hacia-la-muerte-según-la-edad"/>
+    <w:p>
+      <w:pPr>
+        <w:pStyle w:val="Heading2"/>
+      </w:pPr>
+      <w:r>
+        <w:t xml:space="preserve">2. Actitudes hacia la muerte según la edad</w:t>
+      </w:r>
+    </w:p>
+    <w:p>
+      <w:pPr>
+        <w:pStyle w:val="FirstParagraph"/>
+      </w:pPr>
+      <w:r>
+        <w:t xml:space="preserve">(Cátedra de Psicología Evolutiva, 2026i, diapositivas 5-7; Papalia et al., 2009b, pp. 483-484.)</w:t>
       </w:r>
     </w:p>
     <w:p>
@@ -602,13 +892,45 @@
           <w:b/>
           <w:bCs/>
         </w:rPr>
-        <w:t xml:space="preserve">Biológico:</w:t>
-      </w:r>
-      <w:r>
-        <w:t xml:space="preserve"> </w:t>
-      </w:r>
-      <w:r>
-        <w:t xml:space="preserve">la suspensión de los procesos corporales; la tecnología lo volvió más complejo (personas mantenidas con soporte vital).</w:t>
+        <w:t xml:space="preserve">Adultez joven:</w:t>
+      </w:r>
+      <w:r>
+        <w:t xml:space="preserve"> </w:t>
+      </w:r>
+      <w:r>
+        <w:t xml:space="preserve">la mayoría</w:t>
+      </w:r>
+      <w:r>
+        <w:t xml:space="preserve"> </w:t>
+      </w:r>
+      <w:r>
+        <w:rPr>
+          <w:b/>
+          <w:bCs/>
+        </w:rPr>
+        <w:t xml:space="preserve">evita pensar</w:t>
+      </w:r>
+      <w:r>
+        <w:t xml:space="preserve"> </w:t>
+      </w:r>
+      <w:r>
+        <w:t xml:space="preserve">en la muerte. Los adolescentes son más proclives al riesgo por la</w:t>
+      </w:r>
+      <w:r>
+        <w:t xml:space="preserve"> </w:t>
+      </w:r>
+      <w:r>
+        <w:rPr>
+          <w:b/>
+          <w:bCs/>
+        </w:rPr>
+        <w:t xml:space="preserve">fábula personal</w:t>
+      </w:r>
+      <w:r>
+        <w:t xml:space="preserve"> </w:t>
+      </w:r>
+      <w:r>
+        <w:t xml:space="preserve">(la creencia de ser únicos y no estar sujetos a las reglas naturales); esta desaparece a medida que se asumen responsabilidades ocupacionales y familiares.</w:t>
       </w:r>
     </w:p>
     <w:p>
@@ -624,13 +946,52 @@
           <w:b/>
           <w:bCs/>
         </w:rPr>
-        <w:t xml:space="preserve">Social:</w:t>
-      </w:r>
-      <w:r>
-        <w:t xml:space="preserve"> </w:t>
-      </w:r>
-      <w:r>
-        <w:t xml:space="preserve">actitudes, cuidado del moribundo, dónde se muere, rituales de duelo, herencia. Varía mucho entre culturas (en Japón se mantiene un altar a los ancestros; los hopi intentan olvidar al muerto; en México se vela en las tumbas el Día de Muertos).</w:t>
+        <w:t xml:space="preserve">Adultez media:</w:t>
+      </w:r>
+      <w:r>
+        <w:t xml:space="preserve"> </w:t>
+      </w:r>
+      <w:r>
+        <w:t xml:space="preserve">se empieza a</w:t>
+      </w:r>
+      <w:r>
+        <w:t xml:space="preserve"> </w:t>
+      </w:r>
+      <w:r>
+        <w:rPr>
+          <w:b/>
+          <w:bCs/>
+        </w:rPr>
+        <w:t xml:space="preserve">comprender que se va a morir</w:t>
+      </w:r>
+      <w:r>
+        <w:t xml:space="preserve">. Influyen la muerte de los padres, la conciencia de ser la «generación más vieja» y una nueva percepción del tiempo: de «cuántos años viví» a «</w:t>
+      </w:r>
+      <w:r>
+        <w:rPr>
+          <w:b/>
+          <w:bCs/>
+        </w:rPr>
+        <w:t xml:space="preserve">cuántos años me quedan</w:t>
+      </w:r>
+      <w:r>
+        <w:t xml:space="preserve">». Esa conciencia lleva a</w:t>
+      </w:r>
+      <w:r>
+        <w:t xml:space="preserve"> </w:t>
+      </w:r>
+      <w:r>
+        <w:rPr>
+          <w:b/>
+          <w:bCs/>
+        </w:rPr>
+        <w:t xml:space="preserve">reanalizar</w:t>
+      </w:r>
+      <w:r>
+        <w:t xml:space="preserve"> </w:t>
+      </w:r>
+      <w:r>
+        <w:t xml:space="preserve">carreras, matrimonios, amistades y valores.</w:t>
       </w:r>
     </w:p>
     <w:p>
@@ -646,121 +1007,173 @@
           <w:b/>
           <w:bCs/>
         </w:rPr>
-        <w:t xml:space="preserve">Psicológico:</w:t>
-      </w:r>
-      <w:r>
-        <w:t xml:space="preserve"> </w:t>
-      </w:r>
-      <w:r>
-        <w:t xml:space="preserve">cómo se siente cada persona ante su muerte y la de sus seres queridos. Los</w:t>
-      </w:r>
-      <w:r>
-        <w:t xml:space="preserve"> </w:t>
-      </w:r>
-      <w:r>
-        <w:rPr>
-          <w:b/>
-          <w:bCs/>
-        </w:rPr>
-        <w:t xml:space="preserve">rituales</w:t>
-      </w:r>
-      <w:r>
-        <w:t xml:space="preserve"> </w:t>
-      </w:r>
-      <w:r>
-        <w:t xml:space="preserve">dan algo que hacer cuando uno se sentiría desamparado.</w:t>
-      </w:r>
-    </w:p>
-    <w:p>
-      <w:pPr>
-        <w:pStyle w:val="FirstParagraph"/>
-      </w:pPr>
-      <w:r>
-        <w:rPr>
-          <w:b/>
-          <w:bCs/>
-        </w:rPr>
-        <w:t xml:space="preserve">Hoy:</w:t>
-      </w:r>
-      <w:r>
-        <w:t xml:space="preserve"> </w:t>
-      </w:r>
-      <w:r>
-        <w:t xml:space="preserve">en la sociedad occidental predominan la</w:t>
-      </w:r>
-      <w:r>
-        <w:t xml:space="preserve"> </w:t>
-      </w:r>
-      <w:r>
-        <w:rPr>
-          <w:b/>
-          <w:bCs/>
-        </w:rPr>
-        <w:t xml:space="preserve">evitación y la negación</w:t>
-      </w:r>
-      <w:r>
-        <w:t xml:space="preserve">, pero resurge el interés por afrontar la muerte: la</w:t>
-      </w:r>
-      <w:r>
-        <w:t xml:space="preserve"> </w:t>
-      </w:r>
-      <w:r>
-        <w:rPr>
-          <w:b/>
-          <w:bCs/>
-        </w:rPr>
-        <w:t xml:space="preserve">tanatología</w:t>
-      </w:r>
-      <w:r>
-        <w:t xml:space="preserve"> </w:t>
-      </w:r>
-      <w:r>
-        <w:t xml:space="preserve">(estudio de la muerte y el proceso de morir), la</w:t>
-      </w:r>
-      <w:r>
-        <w:t xml:space="preserve"> </w:t>
-      </w:r>
-      <w:r>
-        <w:rPr>
-          <w:b/>
-          <w:bCs/>
-        </w:rPr>
-        <w:t xml:space="preserve">educación para la muerte</w:t>
-      </w:r>
-      <w:r>
-        <w:t xml:space="preserve"> </w:t>
-      </w:r>
-      <w:r>
-        <w:t xml:space="preserve">y el</w:t>
-      </w:r>
-      <w:r>
-        <w:t xml:space="preserve"> </w:t>
-      </w:r>
-      <w:r>
-        <w:rPr>
-          <w:b/>
-          <w:bCs/>
-        </w:rPr>
-        <w:t xml:space="preserve">cuidado de hospicio</w:t>
-      </w:r>
-      <w:r>
-        <w:t xml:space="preserve">, una atención</w:t>
-      </w:r>
-      <w:r>
-        <w:t xml:space="preserve"> </w:t>
-      </w:r>
-      <w:r>
-        <w:rPr>
-          <w:b/>
-          <w:bCs/>
-        </w:rPr>
-        <w:t xml:space="preserve">paliativa</w:t>
-      </w:r>
-      <w:r>
-        <w:t xml:space="preserve"> </w:t>
-      </w:r>
-      <w:r>
-        <w:t xml:space="preserve">(aliviar el dolor y dar calidad de vida) centrada en el enfermo terminal y su familia (pp. 481-482).</w:t>
+        <w:t xml:space="preserve">Vejez:</w:t>
+      </w:r>
+      <w:r>
+        <w:t xml:space="preserve"> </w:t>
+      </w:r>
+      <w:r>
+        <w:t xml:space="preserve">en general los ancianos están</w:t>
+      </w:r>
+      <w:r>
+        <w:t xml:space="preserve"> </w:t>
+      </w:r>
+      <w:r>
+        <w:rPr>
+          <w:b/>
+          <w:bCs/>
+        </w:rPr>
+        <w:t xml:space="preserve">menos ansiosos</w:t>
+      </w:r>
+      <w:r>
+        <w:t xml:space="preserve"> </w:t>
+      </w:r>
+      <w:r>
+        <w:t xml:space="preserve">ante la muerte, usan estrategias de afrontamiento</w:t>
+      </w:r>
+      <w:r>
+        <w:t xml:space="preserve"> </w:t>
+      </w:r>
+      <w:r>
+        <w:rPr>
+          <w:b/>
+          <w:bCs/>
+        </w:rPr>
+        <w:t xml:space="preserve">enfocadas en la emoción</w:t>
+      </w:r>
+      <w:r>
+        <w:t xml:space="preserve"> </w:t>
+      </w:r>
+      <w:r>
+        <w:t xml:space="preserve">(→ C22) y, a medida que pierden amigos y parientes,</w:t>
+      </w:r>
+      <w:r>
+        <w:t xml:space="preserve"> </w:t>
+      </w:r>
+      <w:r>
+        <w:rPr>
+          <w:b/>
+          <w:bCs/>
+        </w:rPr>
+        <w:t xml:space="preserve">reorganizan gradualmente</w:t>
+      </w:r>
+      <w:r>
+        <w:t xml:space="preserve"> </w:t>
+      </w:r>
+      <w:r>
+        <w:t xml:space="preserve">sus pensamientos y sentimientos para aceptar su propia mortalidad. Según Erikson, la crisis de</w:t>
+      </w:r>
+      <w:r>
+        <w:t xml:space="preserve"> </w:t>
+      </w:r>
+      <w:r>
+        <w:rPr>
+          <w:b/>
+          <w:bCs/>
+        </w:rPr>
+        <w:t xml:space="preserve">integridad frente a desesperación</w:t>
+      </w:r>
+      <w:r>
+        <w:t xml:space="preserve"> </w:t>
+      </w:r>
+      <w:r>
+        <w:t xml:space="preserve">se resuelve con una vida vista como significativa (Papalia et al., 2009b, p. 484).</w:t>
+      </w:r>
+    </w:p>
+    <w:p>
+      <w:pPr>
+        <w:pStyle w:val="RecuadroEsqueleto"/>
+      </w:pPr>
+      <w:r>
+        <w:rPr>
+          <w:b/>
+          <w:bCs/>
+        </w:rPr>
+        <w:t xml:space="preserve">Esqueleto de la respuesta:</w:t>
+      </w:r>
+    </w:p>
+    <w:p>
+      <w:pPr>
+        <w:pStyle w:val="RecuadroEsqueleto"/>
+      </w:pPr>
+      <w:r>
+        <w:t xml:space="preserve">1. </w:t>
+      </w:r>
+      <w:r>
+        <w:rPr>
+          <w:b/>
+          <w:bCs/>
+        </w:rPr>
+        <w:t xml:space="preserve">Tesis:</w:t>
+      </w:r>
+      <w:r>
+        <w:t xml:space="preserve"> </w:t>
+      </w:r>
+      <w:r>
+        <w:t xml:space="preserve">las actitudes ante la muerte cambian con la edad y el contexto.</w:t>
+      </w:r>
+    </w:p>
+    <w:p>
+      <w:pPr>
+        <w:pStyle w:val="RecuadroEsqueleto"/>
+      </w:pPr>
+      <w:r>
+        <w:t xml:space="preserve">2. </w:t>
+      </w:r>
+      <w:r>
+        <w:rPr>
+          <w:b/>
+          <w:bCs/>
+        </w:rPr>
+        <w:t xml:space="preserve">Adultez joven:</w:t>
+      </w:r>
+      <w:r>
+        <w:t xml:space="preserve"> </w:t>
+      </w:r>
+      <w:r>
+        <w:t xml:space="preserve">la evitan; fábula personal (Papalia et al., 2009b, p. 483).</w:t>
+      </w:r>
+    </w:p>
+    <w:p>
+      <w:pPr>
+        <w:pStyle w:val="RecuadroEsqueleto"/>
+      </w:pPr>
+      <w:r>
+        <w:t xml:space="preserve">3. </w:t>
+      </w:r>
+      <w:r>
+        <w:rPr>
+          <w:b/>
+          <w:bCs/>
+        </w:rPr>
+        <w:t xml:space="preserve">Adultez media:</w:t>
+      </w:r>
+      <w:r>
+        <w:t xml:space="preserve"> </w:t>
+      </w:r>
+      <w:r>
+        <w:t xml:space="preserve">toman conciencia; cuántos años me quedan (pp. 483-484).</w:t>
+      </w:r>
+    </w:p>
+    <w:p>
+      <w:pPr>
+        <w:pStyle w:val="RecuadroEsqueleto"/>
+      </w:pPr>
+      <w:r>
+        <w:t xml:space="preserve">4. </w:t>
+      </w:r>
+      <w:r>
+        <w:rPr>
+          <w:b/>
+          <w:bCs/>
+        </w:rPr>
+        <w:t xml:space="preserve">Vejez:</w:t>
+      </w:r>
+      <w:r>
+        <w:t xml:space="preserve"> </w:t>
+      </w:r>
+      <w:r>
+        <w:t xml:space="preserve">menos ansiedad; estrategias centradas en la emoción; integridad vs. desesperación (p. 484).</w:t>
       </w:r>
     </w:p>
     <w:p>
@@ -788,13 +1201,13 @@
           <w:i/>
           <w:iCs/>
         </w:rPr>
-        <w:t xml:space="preserve">cuidado de hospicio</w:t>
-      </w:r>
-      <w:r>
-        <w:t xml:space="preserve"> </w:t>
-      </w:r>
-      <w:r>
-        <w:t xml:space="preserve">(paliativo, centrado en la familia) con</w:t>
+        <w:t xml:space="preserve">fábula personal</w:t>
+      </w:r>
+      <w:r>
+        <w:t xml:space="preserve"> </w:t>
+      </w:r>
+      <w:r>
+        <w:t xml:space="preserve">(propia de adolescentes y adultos jóvenes: «a mí no me va a pasar») con</w:t>
       </w:r>
       <w:r>
         <w:t xml:space="preserve"> </w:t>
@@ -804,13 +1217,13 @@
           <w:i/>
           <w:iCs/>
         </w:rPr>
-        <w:t xml:space="preserve">cuidado hospitalario</w:t>
-      </w:r>
-      <w:r>
-        <w:t xml:space="preserve"> </w:t>
-      </w:r>
-      <w:r>
-        <w:t xml:space="preserve">tradicional (orientado a curar) (Papalia et al., 2009b, pp. 481-482).</w:t>
+        <w:t xml:space="preserve">conciencia de la mortalidad</w:t>
+      </w:r>
+      <w:r>
+        <w:t xml:space="preserve"> </w:t>
+      </w:r>
+      <w:r>
+        <w:t xml:space="preserve">de la adultez media (Papalia et al., 2009b, pp. 483-484).</w:t>
       </w:r>
     </w:p>
     <w:p>
@@ -820,14 +1233,22 @@
         </w:pict>
       </w:r>
     </w:p>
-    <w:bookmarkEnd w:id="10"/>
-    <w:bookmarkStart w:id="11" w:name="actitudes-hacia-la-muerte-según-la-edad"/>
+    <w:bookmarkEnd w:id="11"/>
+    <w:bookmarkStart w:id="12" w:name="X54bc5a2e2f10b3c289e56732d51a1e05eb42ebc"/>
     <w:p>
       <w:pPr>
         <w:pStyle w:val="Heading2"/>
       </w:pPr>
       <w:r>
-        <w:t xml:space="preserve">2. Actitudes hacia la muerte según la edad</w:t>
+        <w:t xml:space="preserve">3. Aspectos de la muerte: biológico, social y psicológico</w:t>
+      </w:r>
+    </w:p>
+    <w:p>
+      <w:pPr>
+        <w:pStyle w:val="FirstParagraph"/>
+      </w:pPr>
+      <w:r>
+        <w:t xml:space="preserve">(Cátedra de Psicología Evolutiva, 2026i, diapositivas 8-11; Papalia et al., 2009b, pp. 479-481.)</w:t>
       </w:r>
     </w:p>
     <w:p>
@@ -843,29 +1264,26 @@
           <w:b/>
           <w:bCs/>
         </w:rPr>
-        <w:t xml:space="preserve">Adultez joven:</w:t>
-      </w:r>
-      <w:r>
-        <w:t xml:space="preserve"> </w:t>
-      </w:r>
-      <w:r>
-        <w:t xml:space="preserve">la mayoría evita pensar en la muerte; sienten que no les puede pasar. Si enferman gravemente, sienten una</w:t>
-      </w:r>
-      <w:r>
-        <w:t xml:space="preserve"> </w:t>
-      </w:r>
-      <w:r>
-        <w:rPr>
-          <w:b/>
-          <w:bCs/>
-        </w:rPr>
-        <w:t xml:space="preserve">frustración</w:t>
-      </w:r>
-      <w:r>
-        <w:t xml:space="preserve"> </w:t>
-      </w:r>
-      <w:r>
-        <w:t xml:space="preserve">intensa («trabajaron tanto… para nada») que se vuelve ira (Papalia et al., 2009b, p. 483).</w:t>
+        <w:t xml:space="preserve">Biológico:</w:t>
+      </w:r>
+      <w:r>
+        <w:t xml:space="preserve"> </w:t>
+      </w:r>
+      <w:r>
+        <w:t xml:space="preserve">la</w:t>
+      </w:r>
+      <w:r>
+        <w:t xml:space="preserve"> </w:t>
+      </w:r>
+      <w:r>
+        <w:rPr>
+          <w:b/>
+          <w:bCs/>
+        </w:rPr>
+        <w:t xml:space="preserve">suspensión de los procesos corporales</w:t>
+      </w:r>
+      <w:r>
+        <w:t xml:space="preserve">: cuando la respiración y el latido cardíaco cesan durante un tiempo significativo, o cuando concluye toda la actividad eléctrica del cerebro.</w:t>
       </w:r>
     </w:p>
     <w:p>
@@ -881,42 +1299,68 @@
           <w:b/>
           <w:bCs/>
         </w:rPr>
-        <w:t xml:space="preserve">Adultez media:</w:t>
-      </w:r>
-      <w:r>
-        <w:t xml:space="preserve"> </w:t>
-      </w:r>
-      <w:r>
-        <w:t xml:space="preserve">es cuando la mayoría</w:t>
-      </w:r>
-      <w:r>
-        <w:t xml:space="preserve"> </w:t>
-      </w:r>
-      <w:r>
-        <w:rPr>
-          <w:b/>
-          <w:bCs/>
-        </w:rPr>
-        <w:t xml:space="preserve">toma conciencia de que va a morir</w:t>
-      </w:r>
-      <w:r>
-        <w:t xml:space="preserve">: más obituarios con nombres conocidos, señales del cuerpo, la muerte de los padres (se pasa a ser la «generación más vieja»). Cambia la percepción del tiempo: de cuántos años se vivieron a</w:t>
-      </w:r>
-      <w:r>
-        <w:t xml:space="preserve"> </w:t>
-      </w:r>
-      <w:r>
-        <w:rPr>
-          <w:b/>
-          <w:bCs/>
-        </w:rPr>
-        <w:t xml:space="preserve">cuántos quedan</w:t>
-      </w:r>
-      <w:r>
-        <w:t xml:space="preserve"> </w:t>
-      </w:r>
-      <w:r>
-        <w:t xml:space="preserve">(Neugarten) (pp. 483-484).</w:t>
+        <w:t xml:space="preserve">Social:</w:t>
+      </w:r>
+      <w:r>
+        <w:t xml:space="preserve"> </w:t>
+      </w:r>
+      <w:r>
+        <w:t xml:space="preserve">las actitudes hacia la muerte, el cuidado y el comportamiento hacia el moribundo;</w:t>
+      </w:r>
+      <w:r>
+        <w:t xml:space="preserve"> </w:t>
+      </w:r>
+      <w:r>
+        <w:rPr>
+          <w:b/>
+          <w:bCs/>
+        </w:rPr>
+        <w:t xml:space="preserve">dónde</w:t>
+      </w:r>
+      <w:r>
+        <w:t xml:space="preserve"> </w:t>
+      </w:r>
+      <w:r>
+        <w:t xml:space="preserve">tiene lugar la muerte y los esfuerzos por posponerla o anticiparla; la</w:t>
+      </w:r>
+      <w:r>
+        <w:t xml:space="preserve"> </w:t>
+      </w:r>
+      <w:r>
+        <w:rPr>
+          <w:b/>
+          <w:bCs/>
+        </w:rPr>
+        <w:t xml:space="preserve">voluntad del difunto</w:t>
+      </w:r>
+      <w:r>
+        <w:t xml:space="preserve">; las</w:t>
+      </w:r>
+      <w:r>
+        <w:t xml:space="preserve"> </w:t>
+      </w:r>
+      <w:r>
+        <w:rPr>
+          <w:b/>
+          <w:bCs/>
+        </w:rPr>
+        <w:t xml:space="preserve">costumbres y los rituales de duelo</w:t>
+      </w:r>
+      <w:r>
+        <w:t xml:space="preserve">; y la</w:t>
+      </w:r>
+      <w:r>
+        <w:t xml:space="preserve"> </w:t>
+      </w:r>
+      <w:r>
+        <w:rPr>
+          <w:b/>
+          <w:bCs/>
+        </w:rPr>
+        <w:t xml:space="preserve">transferencia de posesiones y roles</w:t>
+      </w:r>
+      <w:r>
+        <w:t xml:space="preserve">.</w:t>
       </w:r>
     </w:p>
     <w:p>
@@ -932,55 +1376,74 @@
           <w:b/>
           <w:bCs/>
         </w:rPr>
-        <w:t xml:space="preserve">Adultez tardía:</w:t>
-      </w:r>
-      <w:r>
-        <w:t xml:space="preserve"> </w:t>
-      </w:r>
-      <w:r>
-        <w:t xml:space="preserve">en general están</w:t>
-      </w:r>
-      <w:r>
-        <w:t xml:space="preserve"> </w:t>
-      </w:r>
-      <w:r>
-        <w:rPr>
-          <w:b/>
-          <w:bCs/>
-        </w:rPr>
-        <w:t xml:space="preserve">menos ansiosos</w:t>
-      </w:r>
-      <w:r>
-        <w:t xml:space="preserve"> </w:t>
-      </w:r>
-      <w:r>
-        <w:t xml:space="preserve">ante la muerte que los adultos medios y usan más estrategias centradas en la emoción. Según</w:t>
-      </w:r>
-      <w:r>
-        <w:t xml:space="preserve"> </w:t>
-      </w:r>
-      <w:r>
-        <w:rPr>
-          <w:b/>
-          <w:bCs/>
-        </w:rPr>
-        <w:t xml:space="preserve">Erikson</w:t>
-      </w:r>
-      <w:r>
-        <w:t xml:space="preserve">, enfrentan la crisis de</w:t>
-      </w:r>
-      <w:r>
-        <w:t xml:space="preserve"> </w:t>
-      </w:r>
-      <w:r>
-        <w:rPr>
-          <w:b/>
-          <w:bCs/>
-        </w:rPr>
-        <w:t xml:space="preserve">integridad vs. desesperación</w:t>
-      </w:r>
-      <w:r>
-        <w:t xml:space="preserve">: quienes la resuelven aceptan lo que hicieron con su vida y su muerte cercana; quienes sienten que su vida tuvo sentido la enfrentan mejor (p. 484).</w:t>
+        <w:t xml:space="preserve">Psicológico:</w:t>
+      </w:r>
+      <w:r>
+        <w:t xml:space="preserve"> </w:t>
+      </w:r>
+      <w:r>
+        <w:t xml:space="preserve">cómo se sienten las personas ante su propia muerte y la de sus seres cercanos. Los</w:t>
+      </w:r>
+      <w:r>
+        <w:t xml:space="preserve"> </w:t>
+      </w:r>
+      <w:r>
+        <w:rPr>
+          <w:b/>
+          <w:bCs/>
+        </w:rPr>
+        <w:t xml:space="preserve">rituales</w:t>
+      </w:r>
+      <w:r>
+        <w:t xml:space="preserve"> </w:t>
+      </w:r>
+      <w:r>
+        <w:t xml:space="preserve">cumplen un papel: (1) dan</w:t>
+      </w:r>
+      <w:r>
+        <w:t xml:space="preserve"> </w:t>
+      </w:r>
+      <w:r>
+        <w:rPr>
+          <w:b/>
+          <w:bCs/>
+        </w:rPr>
+        <w:t xml:space="preserve">algo importante que hacer</w:t>
+      </w:r>
+      <w:r>
+        <w:t xml:space="preserve"> </w:t>
+      </w:r>
+      <w:r>
+        <w:t xml:space="preserve">cuando de otro modo uno se sentiría desamparado; (2) algunos permiten una</w:t>
+      </w:r>
+      <w:r>
+        <w:t xml:space="preserve"> </w:t>
+      </w:r>
+      <w:r>
+        <w:rPr>
+          <w:b/>
+          <w:bCs/>
+        </w:rPr>
+        <w:t xml:space="preserve">profunda interacción</w:t>
+      </w:r>
+      <w:r>
+        <w:t xml:space="preserve"> </w:t>
+      </w:r>
+      <w:r>
+        <w:t xml:space="preserve">con el moribundo o con la persona fallecida; (3)</w:t>
+      </w:r>
+      <w:r>
+        <w:t xml:space="preserve"> </w:t>
+      </w:r>
+      <w:r>
+        <w:rPr>
+          <w:b/>
+          <w:bCs/>
+        </w:rPr>
+        <w:t xml:space="preserve">afirman la fortaleza y eficacia de la comunidad</w:t>
+      </w:r>
+      <w:r>
+        <w:t xml:space="preserve">.</w:t>
       </w:r>
     </w:p>
     <w:p>
@@ -992,13 +1455,79 @@
           <w:b/>
           <w:bCs/>
         </w:rPr>
-        <w:t xml:space="preserve">La muerte no significa lo mismo para todos:</w:t>
-      </w:r>
-      <w:r>
-        <w:t xml:space="preserve"> </w:t>
-      </w:r>
-      <w:r>
-        <w:t xml:space="preserve">depende del momento en que llega (no es igual a los 20 que a los 85), de la cultura y de la cohorte (p. 482).</w:t>
+        <w:t xml:space="preserve">Actividad de la clase</w:t>
+      </w:r>
+      <w:r>
+        <w:t xml:space="preserve"> </w:t>
+      </w:r>
+      <w:r>
+        <w:t xml:space="preserve">(diapositiva 9): ¿qué significa la muerte en Argentina y qué rituales la acompañan? El libro no trata el caso argentino; da ejemplos de otras culturas para comparar: en Japón se mantiene un altar a los ancestros; los hopi intentan olvidar rápido al muerto; en el funeral judío ortodoxo el ataúd sencillo cerrado ayuda a afrontar la realidad (Papalia et al., 2009b, pp. 480-481). Armá tu respuesta con tu experiencia y relacionala con las tres funciones de los rituales.</w:t>
+      </w:r>
+    </w:p>
+    <w:p>
+      <w:pPr>
+        <w:pStyle w:val="RecuadroAtencion"/>
+      </w:pPr>
+      <w:r>
+        <w:t xml:space="preserve">⚠</w:t>
+      </w:r>
+      <w:r>
+        <w:t xml:space="preserve"> </w:t>
+      </w:r>
+      <w:r>
+        <w:rPr>
+          <w:b/>
+          <w:bCs/>
+        </w:rPr>
+        <w:t xml:space="preserve">No confundir:</w:t>
+      </w:r>
+      <w:r>
+        <w:t xml:space="preserve"> </w:t>
+      </w:r>
+      <w:r>
+        <w:rPr>
+          <w:i/>
+          <w:iCs/>
+        </w:rPr>
+        <w:t xml:space="preserve">muerte biológica</w:t>
+      </w:r>
+      <w:r>
+        <w:t xml:space="preserve"> </w:t>
+      </w:r>
+      <w:r>
+        <w:t xml:space="preserve">(cese de procesos corporales),</w:t>
+      </w:r>
+      <w:r>
+        <w:t xml:space="preserve"> </w:t>
+      </w:r>
+      <w:r>
+        <w:rPr>
+          <w:i/>
+          <w:iCs/>
+        </w:rPr>
+        <w:t xml:space="preserve">social</w:t>
+      </w:r>
+      <w:r>
+        <w:t xml:space="preserve"> </w:t>
+      </w:r>
+      <w:r>
+        <w:t xml:space="preserve">(rituales, cuidado, herencia) y</w:t>
+      </w:r>
+      <w:r>
+        <w:t xml:space="preserve"> </w:t>
+      </w:r>
+      <w:r>
+        <w:rPr>
+          <w:i/>
+          <w:iCs/>
+        </w:rPr>
+        <w:t xml:space="preserve">psicológica</w:t>
+      </w:r>
+      <w:r>
+        <w:t xml:space="preserve"> </w:t>
+      </w:r>
+      <w:r>
+        <w:t xml:space="preserve">(sentimientos ante la propia muerte y la ajena) (Cátedra de Psicología Evolutiva, 2026i, diapositivas 8, 10, 11).</w:t>
       </w:r>
     </w:p>
     <w:p>
@@ -1008,14 +1537,14 @@
         </w:pict>
       </w:r>
     </w:p>
-    <w:bookmarkEnd w:id="11"/>
-    <w:bookmarkStart w:id="12" w:name="X7d1606506d4e41a54ad94df27e7340cd8d9f8e3"/>
+    <w:bookmarkEnd w:id="12"/>
+    <w:bookmarkStart w:id="13" w:name="caída-terminal"/>
     <w:p>
       <w:pPr>
         <w:pStyle w:val="Heading2"/>
       </w:pPr>
       <w:r>
-        <w:t xml:space="preserve">3. El proceso de aceptación de la propia muerte</w:t>
+        <w:t xml:space="preserve">4. Caída terminal</w:t>
       </w:r>
     </w:p>
     <w:p>
@@ -1023,49 +1552,71 @@
         <w:pStyle w:val="FirstParagraph"/>
       </w:pPr>
       <w:r>
-        <w:rPr>
-          <w:b/>
-          <w:bCs/>
-        </w:rPr>
-        <w:t xml:space="preserve">Kübler-Ross</w:t>
-      </w:r>
-      <w:r>
-        <w:t xml:space="preserve"> </w:t>
-      </w:r>
-      <w:r>
-        <w:t xml:space="preserve">(pp. 487-489). Psiquiatra que habló con unos</w:t>
-      </w:r>
-      <w:r>
-        <w:t xml:space="preserve"> </w:t>
-      </w:r>
-      <w:r>
-        <w:rPr>
-          <w:b/>
-          <w:bCs/>
-        </w:rPr>
-        <w:t xml:space="preserve">500 pacientes terminales</w:t>
-      </w:r>
-      <w:r>
-        <w:t xml:space="preserve"> </w:t>
-      </w:r>
-      <w:r>
-        <w:t xml:space="preserve">y notó que la mayoría agradece hablar abiertamente de su condición. Describió</w:t>
-      </w:r>
-      <w:r>
-        <w:t xml:space="preserve"> </w:t>
-      </w:r>
-      <w:r>
-        <w:rPr>
-          <w:b/>
-          <w:bCs/>
-        </w:rPr>
-        <w:t xml:space="preserve">cinco reacciones</w:t>
-      </w:r>
-      <w:r>
-        <w:t xml:space="preserve"> </w:t>
-      </w:r>
-      <w:r>
-        <w:t xml:space="preserve">ante la muerte cercana:</w:t>
+        <w:t xml:space="preserve">Los</w:t>
+      </w:r>
+      <w:r>
+        <w:t xml:space="preserve"> </w:t>
+      </w:r>
+      <w:r>
+        <w:rPr>
+          <w:b/>
+          <w:bCs/>
+        </w:rPr>
+        <w:t xml:space="preserve">cambios psicológicos</w:t>
+      </w:r>
+      <w:r>
+        <w:t xml:space="preserve"> </w:t>
+      </w:r>
+      <w:r>
+        <w:t xml:space="preserve">pueden empezar incluso</w:t>
+      </w:r>
+      <w:r>
+        <w:t xml:space="preserve"> </w:t>
+      </w:r>
+      <w:r>
+        <w:rPr>
+          <w:b/>
+          <w:bCs/>
+        </w:rPr>
+        <w:t xml:space="preserve">antes de que haya signos fisiológicos claros</w:t>
+      </w:r>
+      <w:r>
+        <w:t xml:space="preserve"> </w:t>
+      </w:r>
+      <w:r>
+        <w:t xml:space="preserve">de morir. La</w:t>
+      </w:r>
+      <w:r>
+        <w:t xml:space="preserve"> </w:t>
+      </w:r>
+      <w:r>
+        <w:rPr>
+          <w:b/>
+          <w:bCs/>
+        </w:rPr>
+        <w:t xml:space="preserve">caída terminal</w:t>
+      </w:r>
+      <w:r>
+        <w:t xml:space="preserve"> </w:t>
+      </w:r>
+      <w:r>
+        <w:t xml:space="preserve">es una</w:t>
+      </w:r>
+      <w:r>
+        <w:t xml:space="preserve"> </w:t>
+      </w:r>
+      <w:r>
+        <w:rPr>
+          <w:b/>
+          <w:bCs/>
+        </w:rPr>
+        <w:t xml:space="preserve">súbita reducción del desempeño intelectual poco antes de morir</w:t>
+      </w:r>
+      <w:r>
+        <w:t xml:space="preserve"> </w:t>
+      </w:r>
+      <w:r>
+        <w:t xml:space="preserve">(Cátedra de Psicología Evolutiva, 2026i, diapositiva 12; Papalia et al., 2009b, p. 485):</w:t>
       </w:r>
     </w:p>
     <w:p>
@@ -1077,17 +1628,20 @@
         </w:numPr>
       </w:pPr>
       <w:r>
-        <w:rPr>
-          <w:b/>
-          <w:bCs/>
-        </w:rPr>
-        <w:t xml:space="preserve">Negación:</w:t>
-      </w:r>
-      <w:r>
-        <w:t xml:space="preserve"> </w:t>
-      </w:r>
-      <w:r>
-        <w:t xml:space="preserve">«¡Esto no me puede pasar a mí!».</w:t>
+        <w:t xml:space="preserve">Se halló en</w:t>
+      </w:r>
+      <w:r>
+        <w:t xml:space="preserve"> </w:t>
+      </w:r>
+      <w:r>
+        <w:rPr>
+          <w:b/>
+          <w:bCs/>
+        </w:rPr>
+        <w:t xml:space="preserve">estudios longitudinales de varios países</w:t>
+      </w:r>
+      <w:r>
+        <w:t xml:space="preserve">.</w:t>
       </w:r>
     </w:p>
     <w:p>
@@ -1099,17 +1653,23 @@
         </w:numPr>
       </w:pPr>
       <w:r>
-        <w:rPr>
-          <w:b/>
-          <w:bCs/>
-        </w:rPr>
-        <w:t xml:space="preserve">Ira:</w:t>
-      </w:r>
-      <w:r>
-        <w:t xml:space="preserve"> </w:t>
-      </w:r>
-      <w:r>
-        <w:t xml:space="preserve">«¿Por qué yo?»; envidia de los jóvenes y sanos.</w:t>
+        <w:t xml:space="preserve">Opera</w:t>
+      </w:r>
+      <w:r>
+        <w:t xml:space="preserve"> </w:t>
+      </w:r>
+      <w:r>
+        <w:rPr>
+          <w:b/>
+          <w:bCs/>
+        </w:rPr>
+        <w:t xml:space="preserve">sin importar</w:t>
+      </w:r>
+      <w:r>
+        <w:t xml:space="preserve"> </w:t>
+      </w:r>
+      <w:r>
+        <w:t xml:space="preserve">el estado de salud aparente, el nivel socioeconómico, el género o la causa de muerte.</w:t>
       </w:r>
     </w:p>
     <w:p>
@@ -1121,17 +1681,23 @@
         </w:numPr>
       </w:pPr>
       <w:r>
-        <w:rPr>
-          <w:b/>
-          <w:bCs/>
-        </w:rPr>
-        <w:t xml:space="preserve">Negociación:</w:t>
-      </w:r>
-      <w:r>
-        <w:t xml:space="preserve"> </w:t>
-      </w:r>
-      <w:r>
-        <w:t xml:space="preserve">pedir tiempo extra («si llego a la boda de mi hijo…»).</w:t>
+        <w:t xml:space="preserve">Puede</w:t>
+      </w:r>
+      <w:r>
+        <w:t xml:space="preserve"> </w:t>
+      </w:r>
+      <w:r>
+        <w:rPr>
+          <w:b/>
+          <w:bCs/>
+        </w:rPr>
+        <w:t xml:space="preserve">predecir</w:t>
+      </w:r>
+      <w:r>
+        <w:t xml:space="preserve"> </w:t>
+      </w:r>
+      <w:r>
+        <w:t xml:space="preserve">qué individuos de un grupo de prueba morirán dentro de pocos años.</w:t>
       </w:r>
     </w:p>
     <w:p>
@@ -1143,17 +1709,23 @@
         </w:numPr>
       </w:pPr>
       <w:r>
-        <w:rPr>
-          <w:b/>
-          <w:bCs/>
-        </w:rPr>
-        <w:t xml:space="preserve">Depresión:</w:t>
-      </w:r>
-      <w:r>
-        <w:t xml:space="preserve"> </w:t>
-      </w:r>
-      <w:r>
-        <w:t xml:space="preserve">llorar la pérdida de la propia vida.</w:t>
+        <w:t xml:space="preserve">A veces se atribuye a</w:t>
+      </w:r>
+      <w:r>
+        <w:t xml:space="preserve"> </w:t>
+      </w:r>
+      <w:r>
+        <w:rPr>
+          <w:b/>
+          <w:bCs/>
+        </w:rPr>
+        <w:t xml:space="preserve">afecciones crónicas</w:t>
+      </w:r>
+      <w:r>
+        <w:t xml:space="preserve"> </w:t>
+      </w:r>
+      <w:r>
+        <w:t xml:space="preserve">que agotan la energía mental y la motivación.</w:t>
       </w:r>
     </w:p>
     <w:p>
@@ -1165,228 +1737,36 @@
         </w:numPr>
       </w:pPr>
       <w:r>
-        <w:rPr>
-          <w:b/>
-          <w:bCs/>
-        </w:rPr>
-        <w:t xml:space="preserve">Aceptación:</w:t>
-      </w:r>
-      <w:r>
-        <w:t xml:space="preserve"> </w:t>
-      </w:r>
-      <w:r>
-        <w:t xml:space="preserve">«Mi hora está cerca, y está bien».</w:t>
-      </w:r>
-    </w:p>
-    <w:p>
-      <w:pPr>
-        <w:pStyle w:val="FirstParagraph"/>
-      </w:pPr>
-      <w:r>
-        <w:rPr>
-          <w:b/>
-          <w:bCs/>
-        </w:rPr>
-        <w:t xml:space="preserve">Críticas</w:t>
-      </w:r>
-      <w:r>
-        <w:t xml:space="preserve"> </w:t>
-      </w:r>
-      <w:r>
-        <w:t xml:space="preserve">(p. 487): no son</w:t>
-      </w:r>
-      <w:r>
-        <w:t xml:space="preserve"> </w:t>
-      </w:r>
-      <w:r>
-        <w:rPr>
-          <w:b/>
-          <w:bCs/>
-        </w:rPr>
-        <w:t xml:space="preserve">verdaderas etapas</w:t>
-      </w:r>
-      <w:r>
-        <w:t xml:space="preserve">: no todos pasan por las cinco ni en ese orden (se puede ir y venir entre la ira y la depresión, o sentir ambas); las reacciones varían con la edad, el sexo, la cultura y la personalidad; y para algunas personas la negación o la ira son más saludables que la aceptación. Por eso no deben usarse como criterio de un «buen morir».</w:t>
-      </w:r>
-    </w:p>
-    <w:p>
-      <w:pPr>
-        <w:pStyle w:val="BodyText"/>
-      </w:pPr>
-      <w:r>
-        <w:rPr>
-          <w:b/>
-          <w:bCs/>
-        </w:rPr>
-        <w:t xml:space="preserve">Encontrar sentido</w:t>
-      </w:r>
-      <w:r>
-        <w:t xml:space="preserve"> </w:t>
-      </w:r>
-      <w:r>
-        <w:t xml:space="preserve">(pp. 516-519). La</w:t>
-      </w:r>
-      <w:r>
-        <w:t xml:space="preserve"> </w:t>
-      </w:r>
-      <w:r>
-        <w:rPr>
-          <w:b/>
-          <w:bCs/>
-        </w:rPr>
-        <w:t xml:space="preserve">revisión de vida</w:t>
-      </w:r>
-      <w:r>
-        <w:t xml:space="preserve">, un proceso de reminiscencia común en la vejez, ayuda a lograr la</w:t>
-      </w:r>
-      <w:r>
-        <w:t xml:space="preserve"> </w:t>
-      </w:r>
-      <w:r>
-        <w:rPr>
-          <w:b/>
-          <w:bCs/>
-        </w:rPr>
-        <w:t xml:space="preserve">integridad del yo</w:t>
-      </w:r>
-      <w:r>
-        <w:t xml:space="preserve"> </w:t>
-      </w:r>
-      <w:r>
-        <w:t xml:space="preserve">(Erikson): permite reexaminar valores y completar tareas pendientes, como reconciliarse con alguien. Quienes encuentran</w:t>
-      </w:r>
-      <w:r>
-        <w:t xml:space="preserve"> </w:t>
-      </w:r>
-      <w:r>
-        <w:rPr>
-          <w:b/>
-          <w:bCs/>
-        </w:rPr>
-        <w:t xml:space="preserve">más propósito en la vida tienen menos miedo a morir</w:t>
-      </w:r>
-      <w:r>
-        <w:t xml:space="preserve"> </w:t>
-      </w:r>
-      <w:r>
-        <w:t xml:space="preserve">(Durlak, 1973, citado en Papalia et al., 2009b, p. 519).</w:t>
-      </w:r>
-    </w:p>
-    <w:p>
-      <w:pPr>
-        <w:pStyle w:val="RecuadroEsqueleto"/>
-      </w:pPr>
-      <w:r>
-        <w:rPr>
-          <w:b/>
-          <w:bCs/>
-        </w:rPr>
-        <w:t xml:space="preserve">Esqueleto de la respuesta:</w:t>
-      </w:r>
-    </w:p>
-    <w:p>
-      <w:pPr>
-        <w:pStyle w:val="RecuadroEsqueleto"/>
-      </w:pPr>
-      <w:r>
-        <w:t xml:space="preserve">1. </w:t>
-      </w:r>
-      <w:r>
-        <w:rPr>
-          <w:b/>
-          <w:bCs/>
-        </w:rPr>
-        <w:t xml:space="preserve">Tesis:</w:t>
-      </w:r>
-      <w:r>
-        <w:t xml:space="preserve"> </w:t>
-      </w:r>
-      <w:r>
-        <w:t xml:space="preserve">cinco reacciones frecuentes ante la muerte cercana, no un modelo universal.</w:t>
-      </w:r>
-    </w:p>
-    <w:p>
-      <w:pPr>
-        <w:pStyle w:val="RecuadroEsqueleto"/>
-      </w:pPr>
-      <w:r>
-        <w:t xml:space="preserve">2. </w:t>
-      </w:r>
-      <w:r>
-        <w:rPr>
-          <w:b/>
-          <w:bCs/>
-        </w:rPr>
-        <w:t xml:space="preserve">Etapas:</w:t>
-      </w:r>
-      <w:r>
-        <w:t xml:space="preserve"> </w:t>
-      </w:r>
-      <w:r>
-        <w:t xml:space="preserve">negación, ira, negociación, depresión, aceptación (Papalia et al., 2009b, p. 487).</w:t>
-      </w:r>
-    </w:p>
-    <w:p>
-      <w:pPr>
-        <w:pStyle w:val="RecuadroEsqueleto"/>
-      </w:pPr>
-      <w:r>
-        <w:t xml:space="preserve">3. </w:t>
-      </w:r>
-      <w:r>
-        <w:rPr>
-          <w:b/>
-          <w:bCs/>
-        </w:rPr>
-        <w:t xml:space="preserve">Base:</w:t>
-      </w:r>
-      <w:r>
-        <w:t xml:space="preserve"> </w:t>
-      </w:r>
-      <w:r>
-        <w:t xml:space="preserve">unos 500 pacientes terminales (p. 487).</w:t>
-      </w:r>
-    </w:p>
-    <w:p>
-      <w:pPr>
-        <w:pStyle w:val="RecuadroEsqueleto"/>
-      </w:pPr>
-      <w:r>
-        <w:t xml:space="preserve">4. </w:t>
-      </w:r>
-      <w:r>
-        <w:rPr>
-          <w:b/>
-          <w:bCs/>
-        </w:rPr>
-        <w:t xml:space="preserve">Críticas:</w:t>
-      </w:r>
-      <w:r>
-        <w:t xml:space="preserve"> </w:t>
-      </w:r>
-      <w:r>
-        <w:t xml:space="preserve">no son verdaderas etapas; no secuenciales; no son criterio de «buen morir» (p. 487).</w:t>
-      </w:r>
-    </w:p>
-    <w:p>
-      <w:pPr>
-        <w:pStyle w:val="RecuadroEsqueleto"/>
-      </w:pPr>
-      <w:r>
-        <w:t xml:space="preserve">5. </w:t>
-      </w:r>
-      <w:r>
-        <w:rPr>
-          <w:b/>
-          <w:bCs/>
-        </w:rPr>
-        <w:t xml:space="preserve">Cierre:</w:t>
-      </w:r>
-      <w:r>
-        <w:t xml:space="preserve"> </w:t>
-      </w:r>
-      <w:r>
-        <w:t xml:space="preserve">el sentido de la vida reduce el miedo a morir (p. 519).</w:t>
+        <w:t xml:space="preserve">Afecta habilidades que</w:t>
+      </w:r>
+      <w:r>
+        <w:t xml:space="preserve"> </w:t>
+      </w:r>
+      <w:r>
+        <w:rPr>
+          <w:b/>
+          <w:bCs/>
+        </w:rPr>
+        <w:t xml:space="preserve">relativamente no se dañan con la edad</w:t>
+      </w:r>
+      <w:r>
+        <w:t xml:space="preserve">: el</w:t>
+      </w:r>
+      <w:r>
+        <w:t xml:space="preserve"> </w:t>
+      </w:r>
+      <w:r>
+        <w:rPr>
+          <w:b/>
+          <w:bCs/>
+        </w:rPr>
+        <w:t xml:space="preserve">vocabulario</w:t>
+      </w:r>
+      <w:r>
+        <w:t xml:space="preserve"> </w:t>
+      </w:r>
+      <w:r>
+        <w:t xml:space="preserve">y la visoconstrucción (diapositiva 13; p. 485).</w:t>
       </w:r>
     </w:p>
     <w:p>
@@ -1405,12 +1785,6 @@
           <w:bCs/>
         </w:rPr>
         <w:t xml:space="preserve">No confundir:</w:t>
-      </w:r>
-      <w:r>
-        <w:t xml:space="preserve"> </w:t>
-      </w:r>
-      <w:r>
-        <w:t xml:space="preserve">las</w:t>
       </w:r>
       <w:r>
         <w:t xml:space="preserve"> </w:t>
@@ -1420,13 +1794,13 @@
           <w:i/>
           <w:iCs/>
         </w:rPr>
-        <w:t xml:space="preserve">etapas de Kübler-Ross</w:t>
-      </w:r>
-      <w:r>
-        <w:t xml:space="preserve"> </w:t>
-      </w:r>
-      <w:r>
-        <w:t xml:space="preserve">(reacciones frecuentes) con una</w:t>
+        <w:t xml:space="preserve">caída terminal</w:t>
+      </w:r>
+      <w:r>
+        <w:t xml:space="preserve"> </w:t>
+      </w:r>
+      <w:r>
+        <w:t xml:space="preserve">(descenso intelectual súbito poco antes de morir, incluso en habilidades que la edad no suele afectar) con el</w:t>
       </w:r>
       <w:r>
         <w:t xml:space="preserve"> </w:t>
@@ -1436,13 +1810,13 @@
           <w:i/>
           <w:iCs/>
         </w:rPr>
-        <w:t xml:space="preserve">teoría de etapas universal y ordenada</w:t>
-      </w:r>
-      <w:r>
-        <w:t xml:space="preserve"> </w:t>
-      </w:r>
-      <w:r>
-        <w:t xml:space="preserve">(Papalia et al., 2009b, p. 487).</w:t>
+        <w:t xml:space="preserve">declive cognitivo normal del envejecimiento</w:t>
+      </w:r>
+      <w:r>
+        <w:t xml:space="preserve"> </w:t>
+      </w:r>
+      <w:r>
+        <w:t xml:space="preserve">(gradual y selectivo; → C18) (Papalia et al., 2009b, p. 485).</w:t>
       </w:r>
     </w:p>
     <w:p>
@@ -1452,14 +1826,14 @@
         </w:pict>
       </w:r>
     </w:p>
-    <w:bookmarkEnd w:id="12"/>
-    <w:bookmarkStart w:id="13" w:name="el-proceso-de-duelo"/>
+    <w:bookmarkEnd w:id="13"/>
+    <w:bookmarkStart w:id="14" w:name="educación-para-la-muerte"/>
     <w:p>
       <w:pPr>
         <w:pStyle w:val="Heading2"/>
       </w:pPr>
       <w:r>
-        <w:t xml:space="preserve">4. El proceso de duelo</w:t>
+        <w:t xml:space="preserve">5. Educación para la muerte</w:t>
       </w:r>
     </w:p>
     <w:p>
@@ -1467,17 +1841,23 @@
         <w:pStyle w:val="FirstParagraph"/>
       </w:pPr>
       <w:r>
-        <w:rPr>
-          <w:b/>
-          <w:bCs/>
-        </w:rPr>
-        <w:t xml:space="preserve">Tres términos</w:t>
-      </w:r>
-      <w:r>
-        <w:t xml:space="preserve"> </w:t>
-      </w:r>
-      <w:r>
-        <w:t xml:space="preserve">(Papalia et al., 2009b, p. 487):</w:t>
+        <w:t xml:space="preserve">La clase se pregunta: ¿cómo se puede preparar la gente para su propia muerte o la de sus seres queridos? y ¿cuánto se le debe decir a un paciente terminal sobre su situación? (diapositiva 14). Los</w:t>
+      </w:r>
+      <w:r>
+        <w:t xml:space="preserve"> </w:t>
+      </w:r>
+      <w:r>
+        <w:rPr>
+          <w:b/>
+          <w:bCs/>
+        </w:rPr>
+        <w:t xml:space="preserve">objetivos</w:t>
+      </w:r>
+      <w:r>
+        <w:t xml:space="preserve"> </w:t>
+      </w:r>
+      <w:r>
+        <w:t xml:space="preserve">de la educación para la muerte (diapositiva 15; Leviton, 1977, citado en Papalia et al., 2009b, p. 481):</w:t>
       </w:r>
     </w:p>
     <w:p>
@@ -1489,17 +1869,23 @@
         </w:numPr>
       </w:pPr>
       <w:r>
-        <w:rPr>
-          <w:b/>
-          <w:bCs/>
-        </w:rPr>
-        <w:t xml:space="preserve">Duelo:</w:t>
-      </w:r>
-      <w:r>
-        <w:t xml:space="preserve"> </w:t>
-      </w:r>
-      <w:r>
-        <w:t xml:space="preserve">la pérdida de un ser cercano y el proceso de ajuste posterior (con cambio de estatus y roles: de esposa a viuda).</w:t>
+        <w:t xml:space="preserve">Apaciguar las</w:t>
+      </w:r>
+      <w:r>
+        <w:t xml:space="preserve"> </w:t>
+      </w:r>
+      <w:r>
+        <w:rPr>
+          <w:b/>
+          <w:bCs/>
+        </w:rPr>
+        <w:t xml:space="preserve">ansiedades</w:t>
+      </w:r>
+      <w:r>
+        <w:t xml:space="preserve"> </w:t>
+      </w:r>
+      <w:r>
+        <w:t xml:space="preserve">relacionadas con la muerte.</w:t>
       </w:r>
     </w:p>
     <w:p>
@@ -1511,33 +1897,20 @@
         </w:numPr>
       </w:pPr>
       <w:r>
-        <w:rPr>
-          <w:b/>
-          <w:bCs/>
-        </w:rPr>
-        <w:t xml:space="preserve">Pena:</w:t>
-      </w:r>
-      <w:r>
-        <w:t xml:space="preserve"> </w:t>
-      </w:r>
-      <w:r>
-        <w:t xml:space="preserve">la respuesta</w:t>
-      </w:r>
-      <w:r>
-        <w:t xml:space="preserve"> </w:t>
-      </w:r>
-      <w:r>
-        <w:rPr>
-          <w:b/>
-          <w:bCs/>
-        </w:rPr>
-        <w:t xml:space="preserve">emocional</w:t>
-      </w:r>
-      <w:r>
-        <w:t xml:space="preserve"> </w:t>
-      </w:r>
-      <w:r>
-        <w:t xml:space="preserve">de las primeras fases.</w:t>
+        <w:t xml:space="preserve">Ayudar a cada persona a desarrollar su propio</w:t>
+      </w:r>
+      <w:r>
+        <w:t xml:space="preserve"> </w:t>
+      </w:r>
+      <w:r>
+        <w:rPr>
+          <w:b/>
+          <w:bCs/>
+        </w:rPr>
+        <w:t xml:space="preserve">sistema de creencias</w:t>
+      </w:r>
+      <w:r>
+        <w:t xml:space="preserve">.</w:t>
       </w:r>
     </w:p>
     <w:p>
@@ -1549,33 +1922,126 @@
         </w:numPr>
       </w:pPr>
       <w:r>
-        <w:rPr>
-          <w:b/>
-          <w:bCs/>
-        </w:rPr>
-        <w:t xml:space="preserve">Luto:</w:t>
-      </w:r>
-      <w:r>
-        <w:t xml:space="preserve"> </w:t>
-      </w:r>
-      <w:r>
-        <w:t xml:space="preserve">el</w:t>
-      </w:r>
-      <w:r>
-        <w:t xml:space="preserve"> </w:t>
-      </w:r>
-      <w:r>
-        <w:rPr>
-          <w:b/>
-          <w:bCs/>
-        </w:rPr>
-        <w:t xml:space="preserve">comportamiento</w:t>
-      </w:r>
-      <w:r>
-        <w:t xml:space="preserve"> </w:t>
-      </w:r>
-      <w:r>
-        <w:t xml:space="preserve">culturalmente aceptado del doliente y la comunidad (velorio, rituales).</w:t>
+        <w:t xml:space="preserve">Ver la muerte como un</w:t>
+      </w:r>
+      <w:r>
+        <w:t xml:space="preserve"> </w:t>
+      </w:r>
+      <w:r>
+        <w:rPr>
+          <w:b/>
+          <w:bCs/>
+        </w:rPr>
+        <w:t xml:space="preserve">fin natural</w:t>
+      </w:r>
+      <w:r>
+        <w:t xml:space="preserve"> </w:t>
+      </w:r>
+      <w:r>
+        <w:t xml:space="preserve">de la vida.</w:t>
+      </w:r>
+    </w:p>
+    <w:p>
+      <w:pPr>
+        <w:pStyle w:val="Compact"/>
+        <w:numPr>
+          <w:ilvl w:val="0"/>
+          <w:numId w:val="1004"/>
+        </w:numPr>
+      </w:pPr>
+      <w:r>
+        <w:t xml:space="preserve">Enseñar</w:t>
+      </w:r>
+      <w:r>
+        <w:t xml:space="preserve"> </w:t>
+      </w:r>
+      <w:r>
+        <w:rPr>
+          <w:b/>
+          <w:bCs/>
+        </w:rPr>
+        <w:t xml:space="preserve">formas humanas de tratar al moribundo</w:t>
+      </w:r>
+      <w:r>
+        <w:t xml:space="preserve">.</w:t>
+      </w:r>
+    </w:p>
+    <w:p>
+      <w:pPr>
+        <w:pStyle w:val="Compact"/>
+        <w:numPr>
+          <w:ilvl w:val="0"/>
+          <w:numId w:val="1004"/>
+        </w:numPr>
+      </w:pPr>
+      <w:r>
+        <w:t xml:space="preserve">Dar una visión realista de los</w:t>
+      </w:r>
+      <w:r>
+        <w:t xml:space="preserve"> </w:t>
+      </w:r>
+      <w:r>
+        <w:rPr>
+          <w:b/>
+          <w:bCs/>
+        </w:rPr>
+        <w:t xml:space="preserve">trabajadores de la salud</w:t>
+      </w:r>
+      <w:r>
+        <w:t xml:space="preserve"> </w:t>
+      </w:r>
+      <w:r>
+        <w:t xml:space="preserve">y sus obligaciones con el paciente y su familia.</w:t>
+      </w:r>
+    </w:p>
+    <w:p>
+      <w:pPr>
+        <w:pStyle w:val="Compact"/>
+        <w:numPr>
+          <w:ilvl w:val="0"/>
+          <w:numId w:val="1004"/>
+        </w:numPr>
+      </w:pPr>
+      <w:r>
+        <w:t xml:space="preserve">Ofrecer ayuda para llevar a cabo el</w:t>
+      </w:r>
+      <w:r>
+        <w:t xml:space="preserve"> </w:t>
+      </w:r>
+      <w:r>
+        <w:rPr>
+          <w:b/>
+          <w:bCs/>
+        </w:rPr>
+        <w:t xml:space="preserve">duelo</w:t>
+      </w:r>
+      <w:r>
+        <w:t xml:space="preserve">.</w:t>
+      </w:r>
+    </w:p>
+    <w:p>
+      <w:pPr>
+        <w:pStyle w:val="Compact"/>
+        <w:numPr>
+          <w:ilvl w:val="0"/>
+          <w:numId w:val="1004"/>
+        </w:numPr>
+      </w:pPr>
+      <w:r>
+        <w:t xml:space="preserve">Ayudar a decidir los</w:t>
+      </w:r>
+      <w:r>
+        <w:t xml:space="preserve"> </w:t>
+      </w:r>
+      <w:r>
+        <w:rPr>
+          <w:b/>
+          <w:bCs/>
+        </w:rPr>
+        <w:t xml:space="preserve">tipos de servicios funerarios</w:t>
+      </w:r>
+      <w:r>
+        <w:t xml:space="preserve">.</w:t>
       </w:r>
     </w:p>
     <w:p>
@@ -1583,33 +2049,55 @@
         <w:pStyle w:val="FirstParagraph"/>
       </w:pPr>
       <w:r>
-        <w:rPr>
-          <w:b/>
-          <w:bCs/>
-        </w:rPr>
-        <w:t xml:space="preserve">Pena anticipatoria</w:t>
-      </w:r>
-      <w:r>
-        <w:t xml:space="preserve"> </w:t>
-      </w:r>
-      <w:r>
-        <w:t xml:space="preserve">(p. 492): el pesar que se siente mientras la persona</w:t>
-      </w:r>
-      <w:r>
-        <w:t xml:space="preserve"> </w:t>
-      </w:r>
-      <w:r>
-        <w:rPr>
-          <w:b/>
-          <w:bCs/>
-        </w:rPr>
-        <w:t xml:space="preserve">todavía vive</w:t>
-      </w:r>
-      <w:r>
-        <w:t xml:space="preserve"> </w:t>
-      </w:r>
-      <w:r>
-        <w:t xml:space="preserve">(por ejemplo, en una enfermedad larga). Puede ayudar, aunque no siempre mejora el ajuste posterior.</w:t>
+        <w:t xml:space="preserve">Sobre cuánto decir al paciente, el libro señala que la mayoría de los enfermos terminales agradece poder hablar abiertamente de su condición (Kübler-Ross; p. 487), y que en algunas culturas la familia prefiere protegerlo de la información (por ejemplo, las familias chinas; p. 516).</w:t>
+      </w:r>
+    </w:p>
+    <w:p>
+      <w:r>
+        <w:pict>
+          <v:rect style="width:0;height:1.5pt" o:hralign="center" o:hrstd="t" o:hr="t"/>
+        </w:pict>
+      </w:r>
+    </w:p>
+    <w:bookmarkEnd w:id="14"/>
+    <w:bookmarkStart w:id="15" w:name="Xcc85c7ec81d6978953a16f37fba10bdf5eab7af"/>
+    <w:p>
+      <w:pPr>
+        <w:pStyle w:val="Heading2"/>
+      </w:pPr>
+      <w:r>
+        <w:t xml:space="preserve">6. Proceso de aceptación de la propia muerte y proceso de duelo</w:t>
+      </w:r>
+    </w:p>
+    <w:p>
+      <w:pPr>
+        <w:pStyle w:val="FirstParagraph"/>
+      </w:pPr>
+      <w:r>
+        <w:rPr>
+          <w:b/>
+          <w:bCs/>
+        </w:rPr>
+        <w:t xml:space="preserve">Reacciones ante la muerte cercana (Kübler-Ross).</w:t>
+      </w:r>
+      <w:r>
+        <w:t xml:space="preserve"> </w:t>
+      </w:r>
+      <w:r>
+        <w:t xml:space="preserve">La diapositiva 16 muestra la lámina «Etapas del proceso de morir», en la que solo se lee el texto «Negociación» (el resto es imagen). Del libro: Kübler-Ross, a partir de unos 500 pacientes terminales, describió cinco reacciones:</w:t>
+      </w:r>
+      <w:r>
+        <w:t xml:space="preserve"> </w:t>
+      </w:r>
+      <w:r>
+        <w:rPr>
+          <w:b/>
+          <w:bCs/>
+        </w:rPr>
+        <w:t xml:space="preserve">negación, ira, negociación, depresión y aceptación</w:t>
+      </w:r>
+      <w:r>
+        <w:t xml:space="preserve">. Se critica porque no son verdaderas etapas: no todos las atraviesan ni en ese orden, y no deben tomarse como criterio de un «buen morir» (Papalia et al., 2009b, p. 487).</w:t>
       </w:r>
     </w:p>
     <w:p>
@@ -1621,73 +2109,13 @@
           <w:b/>
           <w:bCs/>
         </w:rPr>
-        <w:t xml:space="preserve">El modelo clásico de tres fases</w:t>
-      </w:r>
-      <w:r>
-        <w:t xml:space="preserve"> </w:t>
-      </w:r>
-      <w:r>
-        <w:t xml:space="preserve">(pp. 492-493): (1)</w:t>
-      </w:r>
-      <w:r>
-        <w:t xml:space="preserve"> </w:t>
-      </w:r>
-      <w:r>
-        <w:rPr>
-          <w:b/>
-          <w:bCs/>
-        </w:rPr>
-        <w:t xml:space="preserve">conmoción e incredulidad</w:t>
-      </w:r>
-      <w:r>
-        <w:t xml:space="preserve">; (2)</w:t>
-      </w:r>
-      <w:r>
-        <w:t xml:space="preserve"> </w:t>
-      </w:r>
-      <w:r>
-        <w:rPr>
-          <w:b/>
-          <w:bCs/>
-        </w:rPr>
-        <w:t xml:space="preserve">preocupación por la memoria</w:t>
-      </w:r>
-      <w:r>
-        <w:t xml:space="preserve"> </w:t>
-      </w:r>
-      <w:r>
-        <w:t xml:space="preserve">de la persona muerta (llanto, insomnio, sentir su presencia); (3)</w:t>
-      </w:r>
-      <w:r>
-        <w:t xml:space="preserve"> </w:t>
-      </w:r>
-      <w:r>
-        <w:rPr>
-          <w:b/>
-          <w:bCs/>
-        </w:rPr>
-        <w:t xml:space="preserve">resolución</w:t>
-      </w:r>
-      <w:r>
-        <w:t xml:space="preserve">: se renueva el interés en la vida y los recuerdos traen cariño en lugar de dolor agudo.</w:t>
-      </w:r>
-    </w:p>
-    <w:p>
-      <w:pPr>
-        <w:pStyle w:val="BodyText"/>
-      </w:pPr>
-      <w:r>
-        <w:rPr>
-          <w:b/>
-          <w:bCs/>
-        </w:rPr>
-        <w:t xml:space="preserve">No hay un único patrón</w:t>
-      </w:r>
-      <w:r>
-        <w:t xml:space="preserve"> </w:t>
-      </w:r>
-      <w:r>
-        <w:t xml:space="preserve">(pp. 493-496):</w:t>
+        <w:t xml:space="preserve">Fases del duelo</w:t>
+      </w:r>
+      <w:r>
+        <w:t xml:space="preserve"> </w:t>
+      </w:r>
+      <w:r>
+        <w:t xml:space="preserve">(diapositiva 16; pp. 492-493):</w:t>
       </w:r>
     </w:p>
     <w:p>
@@ -1703,13 +2131,7 @@
           <w:b/>
           <w:bCs/>
         </w:rPr>
-        <w:t xml:space="preserve">Wortman y Silver</w:t>
-      </w:r>
-      <w:r>
-        <w:t xml:space="preserve"> </w:t>
-      </w:r>
-      <w:r>
-        <w:t xml:space="preserve">mostraron que varias creencias son mitos: que todos se deprimen, que quien no muestra aflicción tendrá problemas después, que hay que «trabajar» la pérdida y que el dolor termina pronto.</w:t>
+        <w:t xml:space="preserve">Conmoción e incredulidad.</w:t>
       </w:r>
     </w:p>
     <w:p>
@@ -1725,26 +2147,7 @@
           <w:b/>
           <w:bCs/>
         </w:rPr>
-        <w:t xml:space="preserve">Estudio CLOC</w:t>
-      </w:r>
-      <w:r>
-        <w:t xml:space="preserve"> </w:t>
-      </w:r>
-      <w:r>
-        <w:t xml:space="preserve">(viudos mayores seguidos a los seis meses y a los cuatro años): el patrón más frecuente fue la</w:t>
-      </w:r>
-      <w:r>
-        <w:t xml:space="preserve"> </w:t>
-      </w:r>
-      <w:r>
-        <w:rPr>
-          <w:b/>
-          <w:bCs/>
-        </w:rPr>
-        <w:t xml:space="preserve">resiliencia (46 %)</w:t>
-      </w:r>
-      <w:r>
-        <w:t xml:space="preserve">, una aflicción baja que disminuye con el tiempo; el duelo «clásico» fue raro (11 %); el 16 % tuvo duelo crónico. Por eso puede ser innecesario o dañino presionar a alguien para que «trabaje» su duelo.</w:t>
+        <w:t xml:space="preserve">Preocupación por la memoria de la persona muerta.</w:t>
       </w:r>
     </w:p>
     <w:p>
@@ -1760,13 +2163,7 @@
           <w:b/>
           <w:bCs/>
         </w:rPr>
-        <w:t xml:space="preserve">Pérdida ambigua</w:t>
-      </w:r>
-      <w:r>
-        <w:t xml:space="preserve"> </w:t>
-      </w:r>
-      <w:r>
-        <w:t xml:space="preserve">(Boss): cuando la pérdida no está definida (un desaparecido sin cuerpo, o alguien presente pero psicológicamente ausente, como en el Alzheimer), la pena queda «congelada» (p. 494).</w:t>
+        <w:t xml:space="preserve">Resolución.</w:t>
       </w:r>
     </w:p>
     <w:p>
@@ -1778,36 +2175,67 @@
           <w:b/>
           <w:bCs/>
         </w:rPr>
-        <w:t xml:space="preserve">La viudez</w:t>
-      </w:r>
-      <w:r>
-        <w:t xml:space="preserve"> </w:t>
-      </w:r>
-      <w:r>
-        <w:t xml:space="preserve">(pp. 497-499): es uno de los eventos más estresantes; implica perder el rol de cónyuge, cambios sociales y económicos, y riesgos para la salud. Se ajustan mejor quienes se mantienen ocupados, toman nuevos roles y tienen</w:t>
-      </w:r>
-      <w:r>
-        <w:t xml:space="preserve"> </w:t>
-      </w:r>
-      <w:r>
-        <w:rPr>
-          <w:b/>
-          <w:bCs/>
-        </w:rPr>
-        <w:t xml:space="preserve">apoyo social</w:t>
-      </w:r>
-      <w:r>
-        <w:t xml:space="preserve">. Más que la edad, importan las</w:t>
-      </w:r>
-      <w:r>
-        <w:t xml:space="preserve"> </w:t>
-      </w:r>
-      <w:r>
-        <w:rPr>
-          <w:b/>
-          <w:bCs/>
-        </w:rPr>
-        <w:t xml:space="preserve">habilidades de afrontamiento</w:t>
+        <w:t xml:space="preserve">¿Cuán universal es la experiencia del duelo?</w:t>
+      </w:r>
+      <w:r>
+        <w:t xml:space="preserve"> </w:t>
+      </w:r>
+      <w:r>
+        <w:t xml:space="preserve">(diapositivas 16-18). Se presentan</w:t>
+      </w:r>
+      <w:r>
+        <w:t xml:space="preserve"> </w:t>
+      </w:r>
+      <w:r>
+        <w:rPr>
+          <w:b/>
+          <w:bCs/>
+        </w:rPr>
+        <w:t xml:space="preserve">cinco creencias</w:t>
+      </w:r>
+      <w:r>
+        <w:t xml:space="preserve"> </w:t>
+      </w:r>
+      <w:r>
+        <w:t xml:space="preserve">habituales, que Wortman y Silver (1989) mostraron que son</w:t>
+      </w:r>
+      <w:r>
+        <w:t xml:space="preserve"> </w:t>
+      </w:r>
+      <w:r>
+        <w:rPr>
+          <w:b/>
+          <w:bCs/>
+        </w:rPr>
+        <w:t xml:space="preserve">más mito que realidad</w:t>
+      </w:r>
+      <w:r>
+        <w:t xml:space="preserve"> </w:t>
+      </w:r>
+      <w:r>
+        <w:t xml:space="preserve">(Papalia et al., 2009b, pp. 493-494):</w:t>
+      </w:r>
+    </w:p>
+    <w:p>
+      <w:pPr>
+        <w:pStyle w:val="Compact"/>
+        <w:numPr>
+          <w:ilvl w:val="0"/>
+          <w:numId w:val="1006"/>
+        </w:numPr>
+      </w:pPr>
+      <w:r>
+        <w:t xml:space="preserve">Todo el que sufre una pérdida severa</w:t>
+      </w:r>
+      <w:r>
+        <w:t xml:space="preserve"> </w:t>
+      </w:r>
+      <w:r>
+        <w:rPr>
+          <w:b/>
+          <w:bCs/>
+        </w:rPr>
+        <w:t xml:space="preserve">estará perturbado y deprimido</w:t>
       </w:r>
       <w:r>
         <w:t xml:space="preserve">.</w:t>
@@ -1815,6 +2243,133 @@
     </w:p>
     <w:p>
       <w:pPr>
+        <w:pStyle w:val="Compact"/>
+        <w:numPr>
+          <w:ilvl w:val="0"/>
+          <w:numId w:val="1006"/>
+        </w:numPr>
+      </w:pPr>
+      <w:r>
+        <w:t xml:space="preserve">Quienes</w:t>
+      </w:r>
+      <w:r>
+        <w:t xml:space="preserve"> </w:t>
+      </w:r>
+      <w:r>
+        <w:rPr>
+          <w:b/>
+          <w:bCs/>
+        </w:rPr>
+        <w:t xml:space="preserve">no muestran aflicción</w:t>
+      </w:r>
+      <w:r>
+        <w:t xml:space="preserve"> </w:t>
+      </w:r>
+      <w:r>
+        <w:t xml:space="preserve">tendrán problemas psicológicos más tarde.</w:t>
+      </w:r>
+    </w:p>
+    <w:p>
+      <w:pPr>
+        <w:pStyle w:val="Compact"/>
+        <w:numPr>
+          <w:ilvl w:val="0"/>
+          <w:numId w:val="1006"/>
+        </w:numPr>
+      </w:pPr>
+      <w:r>
+        <w:t xml:space="preserve">La persona en duelo tiene que</w:t>
+      </w:r>
+      <w:r>
+        <w:t xml:space="preserve"> </w:t>
+      </w:r>
+      <w:r>
+        <w:rPr>
+          <w:b/>
+          <w:bCs/>
+        </w:rPr>
+        <w:t xml:space="preserve">«trabajar» la pérdida</w:t>
+      </w:r>
+      <w:r>
+        <w:t xml:space="preserve">, enfocándose en ella y dándole sentido.</w:t>
+      </w:r>
+    </w:p>
+    <w:p>
+      <w:pPr>
+        <w:pStyle w:val="Compact"/>
+        <w:numPr>
+          <w:ilvl w:val="0"/>
+          <w:numId w:val="1006"/>
+        </w:numPr>
+      </w:pPr>
+      <w:r>
+        <w:t xml:space="preserve">La aflicción intensa</w:t>
+      </w:r>
+      <w:r>
+        <w:t xml:space="preserve"> </w:t>
+      </w:r>
+      <w:r>
+        <w:rPr>
+          <w:b/>
+          <w:bCs/>
+        </w:rPr>
+        <w:t xml:space="preserve">terminará en poco tiempo</w:t>
+      </w:r>
+      <w:r>
+        <w:t xml:space="preserve">.</w:t>
+      </w:r>
+    </w:p>
+    <w:p>
+      <w:pPr>
+        <w:pStyle w:val="Compact"/>
+        <w:numPr>
+          <w:ilvl w:val="0"/>
+          <w:numId w:val="1006"/>
+        </w:numPr>
+      </w:pPr>
+      <w:r>
+        <w:t xml:space="preserve">Las personas</w:t>
+      </w:r>
+      <w:r>
+        <w:t xml:space="preserve"> </w:t>
+      </w:r>
+      <w:r>
+        <w:rPr>
+          <w:b/>
+          <w:bCs/>
+        </w:rPr>
+        <w:t xml:space="preserve">eventualmente aceptarán</w:t>
+      </w:r>
+      <w:r>
+        <w:t xml:space="preserve"> </w:t>
+      </w:r>
+      <w:r>
+        <w:t xml:space="preserve">la pérdida, intelectual y emocionalmente.</w:t>
+      </w:r>
+    </w:p>
+    <w:p>
+      <w:pPr>
+        <w:pStyle w:val="FirstParagraph"/>
+      </w:pPr>
+      <w:r>
+        <w:t xml:space="preserve">Como lo que sigue en el libro (estudio CLOC, patrones de duelo) no se dio en clase, alcanza con saber que el duelo</w:t>
+      </w:r>
+      <w:r>
+        <w:t xml:space="preserve"> </w:t>
+      </w:r>
+      <w:r>
+        <w:rPr>
+          <w:b/>
+          <w:bCs/>
+        </w:rPr>
+        <w:t xml:space="preserve">no sigue un único camino</w:t>
+      </w:r>
+      <w:r>
+        <w:t xml:space="preserve">: algunas personas se recuperan rápido, otras no, y hay quienes no muestran aflicción intensa sin tener problemas después (p. 494).</w:t>
+      </w:r>
+    </w:p>
+    <w:p>
+      <w:pPr>
         <w:pStyle w:val="RecuadroEsqueleto"/>
       </w:pPr>
       <w:r>
@@ -1843,7 +2398,7 @@
         <w:t xml:space="preserve"> </w:t>
       </w:r>
       <w:r>
-        <w:t xml:space="preserve">el duelo no sigue un único patrón.</w:t>
+        <w:t xml:space="preserve">el duelo no es una experiencia universal ni uniforme.</w:t>
       </w:r>
     </w:p>
     <w:p>
@@ -1858,13 +2413,13 @@
           <w:b/>
           <w:bCs/>
         </w:rPr>
-        <w:t xml:space="preserve">Definiciones:</w:t>
-      </w:r>
-      <w:r>
-        <w:t xml:space="preserve"> </w:t>
-      </w:r>
-      <w:r>
-        <w:t xml:space="preserve">duelo, pena, luto (Papalia et al., 2009b, p. 487).</w:t>
+        <w:t xml:space="preserve">Fases del duelo:</w:t>
+      </w:r>
+      <w:r>
+        <w:t xml:space="preserve"> </w:t>
+      </w:r>
+      <w:r>
+        <w:t xml:space="preserve">conmoción e incredulidad, preocupación por la memoria, resolución (Papalia et al., 2009b, pp. 492-493).</w:t>
       </w:r>
     </w:p>
     <w:p>
@@ -1879,13 +2434,13 @@
           <w:b/>
           <w:bCs/>
         </w:rPr>
-        <w:t xml:space="preserve">Modelo clásico:</w:t>
-      </w:r>
-      <w:r>
-        <w:t xml:space="preserve"> </w:t>
-      </w:r>
-      <w:r>
-        <w:t xml:space="preserve">conmoción, preocupación por la memoria, resolución (pp. 492-493).</w:t>
+        <w:t xml:space="preserve">Cinco creencias comunes:</w:t>
+      </w:r>
+      <w:r>
+        <w:t xml:space="preserve"> </w:t>
+      </w:r>
+      <w:r>
+        <w:t xml:space="preserve">depresión, aflicción obligatoria, «trabajar» la pérdida, fin rápido, aceptación (pp. 493-494).</w:t>
       </w:r>
     </w:p>
     <w:p>
@@ -1906,7 +2461,7 @@
         <w:t xml:space="preserve"> </w:t>
       </w:r>
       <w:r>
-        <w:t xml:space="preserve">mitos sobre el duelo (pp. 493-494).</w:t>
+        <w:t xml:space="preserve">son más mito que realidad (p. 494).</w:t>
       </w:r>
     </w:p>
     <w:p>
@@ -1921,34 +2476,13 @@
           <w:b/>
           <w:bCs/>
         </w:rPr>
-        <w:t xml:space="preserve">CLOC:</w:t>
-      </w:r>
-      <w:r>
-        <w:t xml:space="preserve"> </w:t>
-      </w:r>
-      <w:r>
-        <w:t xml:space="preserve">resiliencia 46 %; duelo común 11 % (pp. 495-496).</w:t>
-      </w:r>
-    </w:p>
-    <w:p>
-      <w:pPr>
-        <w:pStyle w:val="RecuadroEsqueleto"/>
-      </w:pPr>
-      <w:r>
-        <w:t xml:space="preserve">6. </w:t>
-      </w:r>
-      <w:r>
-        <w:rPr>
-          <w:b/>
-          <w:bCs/>
-        </w:rPr>
         <w:t xml:space="preserve">Cierre:</w:t>
       </w:r>
       <w:r>
         <w:t xml:space="preserve"> </w:t>
       </w:r>
       <w:r>
-        <w:t xml:space="preserve">no presionar a «trabajar» la pérdida; apoyo social (p. 496).</w:t>
+        <w:t xml:space="preserve">hay que respetar las diferencias individuales y culturales.</w:t>
       </w:r>
     </w:p>
     <w:p>
@@ -1967,6 +2501,12 @@
           <w:bCs/>
         </w:rPr>
         <w:t xml:space="preserve">No confundir:</w:t>
+      </w:r>
+      <w:r>
+        <w:t xml:space="preserve"> </w:t>
+      </w:r>
+      <w:r>
+        <w:t xml:space="preserve">las</w:t>
       </w:r>
       <w:r>
         <w:t xml:space="preserve"> </w:t>
@@ -1976,13 +2516,13 @@
           <w:i/>
           <w:iCs/>
         </w:rPr>
-        <w:t xml:space="preserve">duelo</w:t>
-      </w:r>
-      <w:r>
-        <w:t xml:space="preserve"> </w:t>
-      </w:r>
-      <w:r>
-        <w:t xml:space="preserve">(pérdida y ajuste),</w:t>
+        <w:t xml:space="preserve">etapas de Kübler-Ross</w:t>
+      </w:r>
+      <w:r>
+        <w:t xml:space="preserve"> </w:t>
+      </w:r>
+      <w:r>
+        <w:t xml:space="preserve">(reacciones ante la propia muerte cercana) con las</w:t>
       </w:r>
       <w:r>
         <w:t xml:space="preserve"> </w:t>
@@ -1992,45 +2532,13 @@
           <w:i/>
           <w:iCs/>
         </w:rPr>
-        <w:t xml:space="preserve">pena</w:t>
-      </w:r>
-      <w:r>
-        <w:t xml:space="preserve"> </w:t>
-      </w:r>
-      <w:r>
-        <w:t xml:space="preserve">(emoción) y</w:t>
-      </w:r>
-      <w:r>
-        <w:t xml:space="preserve"> </w:t>
-      </w:r>
-      <w:r>
-        <w:rPr>
-          <w:i/>
-          <w:iCs/>
-        </w:rPr>
-        <w:t xml:space="preserve">luto</w:t>
-      </w:r>
-      <w:r>
-        <w:t xml:space="preserve"> </w:t>
-      </w:r>
-      <w:r>
-        <w:t xml:space="preserve">(conducta cultural); y</w:t>
-      </w:r>
-      <w:r>
-        <w:t xml:space="preserve"> </w:t>
-      </w:r>
-      <w:r>
-        <w:rPr>
-          <w:i/>
-          <w:iCs/>
-        </w:rPr>
-        <w:t xml:space="preserve">resiliencia</w:t>
-      </w:r>
-      <w:r>
-        <w:t xml:space="preserve"> </w:t>
-      </w:r>
-      <w:r>
-        <w:t xml:space="preserve">(aflicción baja que disminuye) con «no haber hecho el duelo» (Papalia et al., 2009b, pp. 487, 496).</w:t>
+        <w:t xml:space="preserve">fases del duelo</w:t>
+      </w:r>
+      <w:r>
+        <w:t xml:space="preserve"> </w:t>
+      </w:r>
+      <w:r>
+        <w:t xml:space="preserve">(proceso de los sobrevivientes ante una pérdida) (Papalia et al., 2009b, pp. 487, 492-493).</w:t>
       </w:r>
     </w:p>
     <w:p>
@@ -2040,14 +2548,14 @@
         </w:pict>
       </w:r>
     </w:p>
-    <w:bookmarkEnd w:id="13"/>
-    <w:bookmarkStart w:id="14" w:name="para-rendir-formato-del-parcial"/>
+    <w:bookmarkEnd w:id="15"/>
+    <w:bookmarkStart w:id="16" w:name="cuidados-paliativos-y-dignidad"/>
     <w:p>
       <w:pPr>
         <w:pStyle w:val="Heading2"/>
       </w:pPr>
       <w:r>
-        <w:t xml:space="preserve">Para rendir (formato del parcial)</w:t>
+        <w:t xml:space="preserve">7. Cuidados paliativos y dignidad</w:t>
       </w:r>
     </w:p>
     <w:p>
@@ -2059,26 +2567,139 @@
           <w:b/>
           <w:bCs/>
         </w:rPr>
-        <w:t xml:space="preserve">1) Opción múltiple.</w:t>
-      </w:r>
-      <w:r>
-        <w:t xml:space="preserve"> </w:t>
-      </w:r>
-      <w:r>
-        <w:t xml:space="preserve">En el estudio CLOC con viudos mayores, el patrón más frecuente fue: (a) el duelo común; (b) el duelo demorado; (c)</w:t>
-      </w:r>
-      <w:r>
-        <w:t xml:space="preserve"> </w:t>
-      </w:r>
-      <w:r>
-        <w:rPr>
-          <w:b/>
-          <w:bCs/>
-        </w:rPr>
-        <w:t xml:space="preserve">la resiliencia</w:t>
-      </w:r>
-      <w:r>
-        <w:t xml:space="preserve">; (d) el duelo crónico. —</w:t>
+        <w:t xml:space="preserve">Cuidados paliativos</w:t>
+      </w:r>
+      <w:r>
+        <w:t xml:space="preserve"> </w:t>
+      </w:r>
+      <w:r>
+        <w:t xml:space="preserve">(en el libro, cuidado de hospicio): la</w:t>
+      </w:r>
+      <w:r>
+        <w:t xml:space="preserve"> </w:t>
+      </w:r>
+      <w:r>
+        <w:rPr>
+          <w:b/>
+          <w:bCs/>
+        </w:rPr>
+        <w:t xml:space="preserve">atención paliativa</w:t>
+      </w:r>
+      <w:r>
+        <w:t xml:space="preserve"> </w:t>
+      </w:r>
+      <w:r>
+        <w:t xml:space="preserve">dirigida al</w:t>
+      </w:r>
+      <w:r>
+        <w:t xml:space="preserve"> </w:t>
+      </w:r>
+      <w:r>
+        <w:rPr>
+          <w:b/>
+          <w:bCs/>
+        </w:rPr>
+        <w:t xml:space="preserve">alivio del dolor, el control de síntomas y la calidad de vida</w:t>
+      </w:r>
+      <w:r>
+        <w:t xml:space="preserve">. Se puede brindar en un hospital u otra institución, en el hogar o combinando ambos, y pone el énfasis en que los pacientes</w:t>
+      </w:r>
+      <w:r>
+        <w:t xml:space="preserve"> </w:t>
+      </w:r>
+      <w:r>
+        <w:rPr>
+          <w:b/>
+          <w:bCs/>
+        </w:rPr>
+        <w:t xml:space="preserve">mueran en paz y con dignidad</w:t>
+      </w:r>
+      <w:r>
+        <w:t xml:space="preserve"> </w:t>
+      </w:r>
+      <w:r>
+        <w:t xml:space="preserve">(Cátedra de Psicología Evolutiva, 2026i, diapositiva 19; Papalia et al., 2009b, pp. 481-482). Surgió porque el hospital típico está hecho para curar y trata mal a los moribundos (la diapositiva 20 muestra una imagen).</w:t>
+      </w:r>
+    </w:p>
+    <w:p>
+      <w:pPr>
+        <w:pStyle w:val="BodyText"/>
+      </w:pPr>
+      <w:r>
+        <w:rPr>
+          <w:b/>
+          <w:bCs/>
+        </w:rPr>
+        <w:t xml:space="preserve">¿Qué significa preservar la dignidad?</w:t>
+      </w:r>
+      <w:r>
+        <w:t xml:space="preserve"> </w:t>
+      </w:r>
+      <w:r>
+        <w:t xml:space="preserve">(diapositivas 19, 21). Se preguntó a</w:t>
+      </w:r>
+      <w:r>
+        <w:t xml:space="preserve"> </w:t>
+      </w:r>
+      <w:r>
+        <w:rPr>
+          <w:b/>
+          <w:bCs/>
+        </w:rPr>
+        <w:t xml:space="preserve">50 pacientes terminales</w:t>
+      </w:r>
+      <w:r>
+        <w:t xml:space="preserve"> </w:t>
+      </w:r>
+      <w:r>
+        <w:t xml:space="preserve">en cuidados paliativos (Chochinov y colaboradores): el cuidado que conserva la dignidad depende no solo de</w:t>
+      </w:r>
+      <w:r>
+        <w:t xml:space="preserve"> </w:t>
+      </w:r>
+      <w:r>
+        <w:rPr>
+          <w:b/>
+          <w:bCs/>
+        </w:rPr>
+        <w:t xml:space="preserve">cómo son tratados</w:t>
+      </w:r>
+      <w:r>
+        <w:t xml:space="preserve"> </w:t>
+      </w:r>
+      <w:r>
+        <w:t xml:space="preserve">los pacientes, sino de</w:t>
+      </w:r>
+      <w:r>
+        <w:t xml:space="preserve"> </w:t>
+      </w:r>
+      <w:r>
+        <w:rPr>
+          <w:b/>
+          <w:bCs/>
+        </w:rPr>
+        <w:t xml:space="preserve">cómo son vistos</w:t>
+      </w:r>
+      <w:r>
+        <w:t xml:space="preserve">: «cuando los pacientes moribundos se ven, y saben que son vistos, como seres merecedores de honor y estima por quienes los cuidan, es más probable que mantengan la dignidad» (Chochinov, 2002, p. 2259, citado en Papalia et al., 2009b, p. 482).</w:t>
+      </w:r>
+    </w:p>
+    <w:p>
+      <w:pPr>
+        <w:pStyle w:val="RecuadroAtencion"/>
+      </w:pPr>
+      <w:r>
+        <w:t xml:space="preserve">⚠</w:t>
+      </w:r>
+      <w:r>
+        <w:t xml:space="preserve"> </w:t>
+      </w:r>
+      <w:r>
+        <w:rPr>
+          <w:b/>
+          <w:bCs/>
+        </w:rPr>
+        <w:t xml:space="preserve">No confundir:</w:t>
       </w:r>
       <w:r>
         <w:t xml:space="preserve"> </w:t>
@@ -2088,31 +2709,13 @@
           <w:i/>
           <w:iCs/>
         </w:rPr>
-        <w:t xml:space="preserve">Respuesta: c</w:t>
-      </w:r>
-      <w:r>
-        <w:t xml:space="preserve"> </w:t>
-      </w:r>
-      <w:r>
-        <w:t xml:space="preserve">(46 %) (Papalia et al., 2009b, pp. 495-496).</w:t>
-      </w:r>
-    </w:p>
-    <w:p>
-      <w:pPr>
-        <w:pStyle w:val="BodyText"/>
-      </w:pPr>
-      <w:r>
-        <w:rPr>
-          <w:b/>
-          <w:bCs/>
-        </w:rPr>
-        <w:t xml:space="preserve">2) Verdadero o falso.</w:t>
-      </w:r>
-      <w:r>
-        <w:t xml:space="preserve"> </w:t>
-      </w:r>
-      <w:r>
-        <w:t xml:space="preserve">«Kübler-Ross demostró que todas las personas pasan por las cinco etapas en el mismo orden.» —</w:t>
+        <w:t xml:space="preserve">cuidado paliativo</w:t>
+      </w:r>
+      <w:r>
+        <w:t xml:space="preserve"> </w:t>
+      </w:r>
+      <w:r>
+        <w:t xml:space="preserve">(aliviar el dolor y acompañar, sin acelerar ni retrasar la muerte) con</w:t>
       </w:r>
       <w:r>
         <w:t xml:space="preserve"> </w:t>
@@ -2122,31 +2725,677 @@
           <w:i/>
           <w:iCs/>
         </w:rPr>
-        <w:t xml:space="preserve">Falso.</w:t>
-      </w:r>
-      <w:r>
-        <w:t xml:space="preserve"> </w:t>
-      </w:r>
-      <w:r>
-        <w:t xml:space="preserve">No son verdaderas etapas: ni todos pasan por las cinco ni en ese orden (p. 487).</w:t>
-      </w:r>
-    </w:p>
+        <w:t xml:space="preserve">eutanasia</w:t>
+      </w:r>
+      <w:r>
+        <w:t xml:space="preserve"> </w:t>
+      </w:r>
+      <w:r>
+        <w:t xml:space="preserve">(procedimiento que apresura o causa la muerte) (Cátedra de Psicología Evolutiva, 2026i, diapositivas 19 y 22).</w:t>
+      </w:r>
+    </w:p>
+    <w:p>
+      <w:r>
+        <w:pict>
+          <v:rect style="width:0;height:1.5pt" o:hralign="center" o:hrstd="t" o:hr="t"/>
+        </w:pict>
+      </w:r>
+    </w:p>
+    <w:bookmarkEnd w:id="16"/>
+    <w:bookmarkStart w:id="17" w:name="eutanasia"/>
+    <w:p>
+      <w:pPr>
+        <w:pStyle w:val="Heading2"/>
+      </w:pPr>
+      <w:r>
+        <w:t xml:space="preserve">8. Eutanasia</w:t>
+      </w:r>
+    </w:p>
+    <w:p>
+      <w:pPr>
+        <w:pStyle w:val="FirstParagraph"/>
+      </w:pPr>
+      <w:r>
+        <w:rPr>
+          <w:b/>
+          <w:bCs/>
+        </w:rPr>
+        <w:t xml:space="preserve">Definición de la cátedra</w:t>
+      </w:r>
+      <w:r>
+        <w:t xml:space="preserve"> </w:t>
+      </w:r>
+      <w:r>
+        <w:t xml:space="preserve">(diapositiva 22): el</w:t>
+      </w:r>
+      <w:r>
+        <w:t xml:space="preserve"> </w:t>
+      </w:r>
+      <w:r>
+        <w:rPr>
+          <w:b/>
+          <w:bCs/>
+        </w:rPr>
+        <w:t xml:space="preserve">empleo o la abstención de procedimientos</w:t>
+      </w:r>
+      <w:r>
+        <w:t xml:space="preserve"> </w:t>
+      </w:r>
+      <w:r>
+        <w:t xml:space="preserve">que permiten</w:t>
+      </w:r>
+      <w:r>
+        <w:t xml:space="preserve"> </w:t>
+      </w:r>
+      <w:r>
+        <w:rPr>
+          <w:b/>
+          <w:bCs/>
+        </w:rPr>
+        <w:t xml:space="preserve">apresurar o causar la muerte</w:t>
+      </w:r>
+      <w:r>
+        <w:t xml:space="preserve"> </w:t>
+      </w:r>
+      <w:r>
+        <w:t xml:space="preserve">de un enfermo incurable, con el fin de evitar el sufrimiento extremo. Se clasifica en dos ejes:</w:t>
+      </w:r>
+    </w:p>
+    <w:tbl>
+      <w:tblPr>
+        <w:tblStyle w:val="Table"/>
+        <w:tblW w:type="pct" w:w="5000"/>
+        <w:tblLayout w:type="fixed"/>
+        <w:tblLook w:firstRow="1" w:lastRow="0" w:firstColumn="0" w:lastColumn="0" w:noHBand="0" w:noVBand="0" w:val="0020"/>
+      </w:tblPr>
+      <w:tblGrid>
+        <w:gridCol w:w="3960"/>
+        <w:gridCol w:w="3960"/>
+      </w:tblGrid>
+      <w:tr>
+        <w:trPr>
+          <w:tblHeader w:val="on"/>
+        </w:trPr>
+        <w:tc>
+          <w:tcPr/>
+          <w:p>
+            <w:pPr>
+              <w:pStyle w:val="Compact"/>
+              <w:jc w:val="left"/>
+            </w:pPr>
+            <w:r>
+              <w:t xml:space="preserve">Eje</w:t>
+            </w:r>
+          </w:p>
+        </w:tc>
+        <w:tc>
+          <w:tcPr/>
+          <w:p>
+            <w:pPr>
+              <w:pStyle w:val="Compact"/>
+              <w:jc w:val="left"/>
+            </w:pPr>
+            <w:r>
+              <w:t xml:space="preserve">Tipos</w:t>
+            </w:r>
+          </w:p>
+        </w:tc>
+      </w:tr>
+      <w:tr>
+        <w:tc>
+          <w:tcPr/>
+          <w:p>
+            <w:pPr>
+              <w:pStyle w:val="Compact"/>
+              <w:jc w:val="left"/>
+            </w:pPr>
+            <w:r>
+              <w:rPr>
+                <w:b/>
+                <w:bCs/>
+              </w:rPr>
+              <w:t xml:space="preserve">Voluntad del paciente</w:t>
+            </w:r>
+          </w:p>
+        </w:tc>
+        <w:tc>
+          <w:tcPr/>
+          <w:p>
+            <w:pPr>
+              <w:pStyle w:val="Compact"/>
+              <w:jc w:val="left"/>
+            </w:pPr>
+            <w:r>
+              <w:rPr>
+                <w:b/>
+                <w:bCs/>
+              </w:rPr>
+              <w:t xml:space="preserve">Voluntaria</w:t>
+            </w:r>
+            <w:r>
+              <w:t xml:space="preserve">: responde a los deseos del paciente.</w:t>
+            </w:r>
+            <w:r>
+              <w:t xml:space="preserve"> </w:t>
+            </w:r>
+            <w:r>
+              <w:rPr>
+                <w:b/>
+                <w:bCs/>
+              </w:rPr>
+              <w:t xml:space="preserve">No voluntaria</w:t>
+            </w:r>
+            <w:r>
+              <w:t xml:space="preserve">: sin conocer su voluntad</w:t>
+            </w:r>
+          </w:p>
+        </w:tc>
+      </w:tr>
+      <w:tr>
+        <w:tc>
+          <w:tcPr/>
+          <w:p>
+            <w:pPr>
+              <w:pStyle w:val="Compact"/>
+              <w:jc w:val="left"/>
+            </w:pPr>
+            <w:r>
+              <w:rPr>
+                <w:b/>
+                <w:bCs/>
+              </w:rPr>
+              <w:t xml:space="preserve">Modo de actuar</w:t>
+            </w:r>
+          </w:p>
+        </w:tc>
+        <w:tc>
+          <w:tcPr/>
+          <w:p>
+            <w:pPr>
+              <w:pStyle w:val="Compact"/>
+              <w:jc w:val="left"/>
+            </w:pPr>
+            <w:r>
+              <w:rPr>
+                <w:b/>
+                <w:bCs/>
+              </w:rPr>
+              <w:t xml:space="preserve">Activa</w:t>
+            </w:r>
+            <w:r>
+              <w:t xml:space="preserve">: acto deliberado de causar la muerte sin sufrimiento del paciente.</w:t>
+            </w:r>
+            <w:r>
+              <w:t xml:space="preserve"> </w:t>
+            </w:r>
+            <w:r>
+              <w:rPr>
+                <w:b/>
+                <w:bCs/>
+              </w:rPr>
+              <w:t xml:space="preserve">Pasiva</w:t>
+            </w:r>
+            <w:r>
+              <w:t xml:space="preserve">: muerte por omisión intencional de una acción médica que garantizara prolongar la vida</w:t>
+            </w:r>
+          </w:p>
+        </w:tc>
+      </w:tr>
+    </w:tbl>
     <w:p>
       <w:pPr>
         <w:pStyle w:val="BodyText"/>
       </w:pPr>
       <w:r>
-        <w:rPr>
-          <w:b/>
-          <w:bCs/>
-        </w:rPr>
-        <w:t xml:space="preserve">3) Verdadero o falso.</w:t>
-      </w:r>
-      <w:r>
-        <w:t xml:space="preserve"> </w:t>
-      </w:r>
-      <w:r>
-        <w:t xml:space="preserve">«El luto es la respuesta emocional ante la pérdida.» —</w:t>
+        <w:t xml:space="preserve">(En el libro, la activa es la acción deliberada para terminar con una vida y la pasiva, retirar o no iniciar un tratamiento que la prolonga; Papalia et al., 2009b, p. 509.)</w:t>
+      </w:r>
+    </w:p>
+    <w:p>
+      <w:pPr>
+        <w:pStyle w:val="BodyText"/>
+      </w:pPr>
+      <w:r>
+        <w:rPr>
+          <w:b/>
+          <w:bCs/>
+        </w:rPr>
+        <w:t xml:space="preserve">Argumentos a favor</w:t>
+      </w:r>
+      <w:r>
+        <w:t xml:space="preserve"> </w:t>
+      </w:r>
+      <w:r>
+        <w:t xml:space="preserve">(diapositiva 23; Papalia et al., 2009b, p. 512):</w:t>
+      </w:r>
+    </w:p>
+    <w:p>
+      <w:pPr>
+        <w:pStyle w:val="Compact"/>
+        <w:numPr>
+          <w:ilvl w:val="0"/>
+          <w:numId w:val="1007"/>
+        </w:numPr>
+      </w:pPr>
+      <w:r>
+        <w:rPr>
+          <w:b/>
+          <w:bCs/>
+        </w:rPr>
+        <w:t xml:space="preserve">Éticos:</w:t>
+      </w:r>
+      <w:r>
+        <w:t xml:space="preserve"> </w:t>
+      </w:r>
+      <w:r>
+        <w:t xml:space="preserve">autonomía y autodeterminación: las personas mentalmente competentes deben poder controlar la calidad de su vida y el momento y la naturaleza de su muerte; preservar la</w:t>
+      </w:r>
+      <w:r>
+        <w:t xml:space="preserve"> </w:t>
+      </w:r>
+      <w:r>
+        <w:rPr>
+          <w:b/>
+          <w:bCs/>
+        </w:rPr>
+        <w:t xml:space="preserve">dignidad y personalidad</w:t>
+      </w:r>
+      <w:r>
+        <w:t xml:space="preserve"> </w:t>
+      </w:r>
+      <w:r>
+        <w:t xml:space="preserve">de quien muere.</w:t>
+      </w:r>
+    </w:p>
+    <w:p>
+      <w:pPr>
+        <w:pStyle w:val="Compact"/>
+        <w:numPr>
+          <w:ilvl w:val="0"/>
+          <w:numId w:val="1007"/>
+        </w:numPr>
+      </w:pPr>
+      <w:r>
+        <w:rPr>
+          <w:b/>
+          <w:bCs/>
+        </w:rPr>
+        <w:t xml:space="preserve">Médicos:</w:t>
+      </w:r>
+      <w:r>
+        <w:t xml:space="preserve"> </w:t>
+      </w:r>
+      <w:r>
+        <w:t xml:space="preserve">el profesional está obligado a tomar todas las medidas necesarias para</w:t>
+      </w:r>
+      <w:r>
+        <w:t xml:space="preserve"> </w:t>
+      </w:r>
+      <w:r>
+        <w:rPr>
+          <w:b/>
+          <w:bCs/>
+        </w:rPr>
+        <w:t xml:space="preserve">aliviar el sufrimiento</w:t>
+      </w:r>
+      <w:r>
+        <w:t xml:space="preserve">.</w:t>
+      </w:r>
+    </w:p>
+    <w:p>
+      <w:pPr>
+        <w:pStyle w:val="Compact"/>
+        <w:numPr>
+          <w:ilvl w:val="0"/>
+          <w:numId w:val="1007"/>
+        </w:numPr>
+      </w:pPr>
+      <w:r>
+        <w:rPr>
+          <w:b/>
+          <w:bCs/>
+        </w:rPr>
+        <w:t xml:space="preserve">Legales:</w:t>
+      </w:r>
+      <w:r>
+        <w:t xml:space="preserve"> </w:t>
+      </w:r>
+      <w:r>
+        <w:rPr>
+          <w:b/>
+          <w:bCs/>
+        </w:rPr>
+        <w:t xml:space="preserve">regular</w:t>
+      </w:r>
+      <w:r>
+        <w:t xml:space="preserve"> </w:t>
+      </w:r>
+      <w:r>
+        <w:t xml:space="preserve">prácticas que ocurren de todos modos por compasión; se pueden generar garantías contra el abuso.</w:t>
+      </w:r>
+    </w:p>
+    <w:p>
+      <w:pPr>
+        <w:pStyle w:val="FirstParagraph"/>
+      </w:pPr>
+      <w:r>
+        <w:rPr>
+          <w:b/>
+          <w:bCs/>
+        </w:rPr>
+        <w:t xml:space="preserve">Argumentos en contra</w:t>
+      </w:r>
+      <w:r>
+        <w:t xml:space="preserve"> </w:t>
+      </w:r>
+      <w:r>
+        <w:t xml:space="preserve">(diapositiva 24; Papalia et al., 2009b, p. 513):</w:t>
+      </w:r>
+    </w:p>
+    <w:p>
+      <w:pPr>
+        <w:pStyle w:val="Compact"/>
+        <w:numPr>
+          <w:ilvl w:val="0"/>
+          <w:numId w:val="1008"/>
+        </w:numPr>
+      </w:pPr>
+      <w:r>
+        <w:rPr>
+          <w:b/>
+          <w:bCs/>
+        </w:rPr>
+        <w:t xml:space="preserve">Éticos:</w:t>
+      </w:r>
+      <w:r>
+        <w:t xml:space="preserve"> </w:t>
+      </w:r>
+      <w:r>
+        <w:t xml:space="preserve">quitar una vida, incluso con consentimiento, está mal; protección de quienes están en</w:t>
+      </w:r>
+      <w:r>
+        <w:t xml:space="preserve"> </w:t>
+      </w:r>
+      <w:r>
+        <w:rPr>
+          <w:b/>
+          <w:bCs/>
+        </w:rPr>
+        <w:t xml:space="preserve">desventaja</w:t>
+      </w:r>
+      <w:r>
+        <w:t xml:space="preserve"> </w:t>
+      </w:r>
+      <w:r>
+        <w:t xml:space="preserve">(grupos estigmatizados);</w:t>
+      </w:r>
+      <w:r>
+        <w:t xml:space="preserve"> </w:t>
+      </w:r>
+      <w:r>
+        <w:rPr>
+          <w:b/>
+          <w:bCs/>
+        </w:rPr>
+        <w:t xml:space="preserve">presión para elegir la muerte</w:t>
+      </w:r>
+      <w:r>
+        <w:t xml:space="preserve"> </w:t>
+      </w:r>
+      <w:r>
+        <w:t xml:space="preserve">y así contener los costos de la atención.</w:t>
+      </w:r>
+    </w:p>
+    <w:p>
+      <w:pPr>
+        <w:pStyle w:val="Compact"/>
+        <w:numPr>
+          <w:ilvl w:val="0"/>
+          <w:numId w:val="1008"/>
+        </w:numPr>
+      </w:pPr>
+      <w:r>
+        <w:rPr>
+          <w:b/>
+          <w:bCs/>
+        </w:rPr>
+        <w:t xml:space="preserve">Médicos:</w:t>
+      </w:r>
+      <w:r>
+        <w:t xml:space="preserve"> </w:t>
+      </w:r>
+      <w:r>
+        <w:t xml:space="preserve">posibilidad de un</w:t>
+      </w:r>
+      <w:r>
+        <w:t xml:space="preserve"> </w:t>
+      </w:r>
+      <w:r>
+        <w:rPr>
+          <w:b/>
+          <w:bCs/>
+        </w:rPr>
+        <w:t xml:space="preserve">mal diagnóstico</w:t>
+      </w:r>
+      <w:r>
+        <w:t xml:space="preserve">;</w:t>
+      </w:r>
+      <w:r>
+        <w:t xml:space="preserve"> </w:t>
+      </w:r>
+      <w:r>
+        <w:rPr>
+          <w:b/>
+          <w:bCs/>
+        </w:rPr>
+        <w:t xml:space="preserve">nuevos tratamientos</w:t>
+      </w:r>
+      <w:r>
+        <w:t xml:space="preserve"> </w:t>
+      </w:r>
+      <w:r>
+        <w:t xml:space="preserve">futuros;</w:t>
+      </w:r>
+      <w:r>
+        <w:t xml:space="preserve"> </w:t>
+      </w:r>
+      <w:r>
+        <w:rPr>
+          <w:b/>
+          <w:bCs/>
+        </w:rPr>
+        <w:t xml:space="preserve">pronóstico incorrecto</w:t>
+      </w:r>
+      <w:r>
+        <w:t xml:space="preserve">; incompatibilidad con el rol del médico.</w:t>
+      </w:r>
+    </w:p>
+    <w:p>
+      <w:pPr>
+        <w:pStyle w:val="Compact"/>
+        <w:numPr>
+          <w:ilvl w:val="0"/>
+          <w:numId w:val="1008"/>
+        </w:numPr>
+      </w:pPr>
+      <w:r>
+        <w:rPr>
+          <w:b/>
+          <w:bCs/>
+        </w:rPr>
+        <w:t xml:space="preserve">Legales:</w:t>
+      </w:r>
+      <w:r>
+        <w:t xml:space="preserve"> </w:t>
+      </w:r>
+      <w:r>
+        <w:t xml:space="preserve">dudas sobre la</w:t>
+      </w:r>
+      <w:r>
+        <w:t xml:space="preserve"> </w:t>
+      </w:r>
+      <w:r>
+        <w:rPr>
+          <w:b/>
+          <w:bCs/>
+        </w:rPr>
+        <w:t xml:space="preserve">coercitividad</w:t>
+      </w:r>
+      <w:r>
+        <w:t xml:space="preserve"> </w:t>
+      </w:r>
+      <w:r>
+        <w:t xml:space="preserve">de las garantías;</w:t>
+      </w:r>
+      <w:r>
+        <w:t xml:space="preserve"> </w:t>
+      </w:r>
+      <w:r>
+        <w:rPr>
+          <w:b/>
+          <w:bCs/>
+        </w:rPr>
+        <w:t xml:space="preserve">juicios</w:t>
+      </w:r>
+      <w:r>
+        <w:t xml:space="preserve"> </w:t>
+      </w:r>
+      <w:r>
+        <w:t xml:space="preserve">cuando la familia no está de acuerdo.</w:t>
+      </w:r>
+    </w:p>
+    <w:p>
+      <w:pPr>
+        <w:pStyle w:val="RecuadroEsqueleto"/>
+      </w:pPr>
+      <w:r>
+        <w:rPr>
+          <w:b/>
+          <w:bCs/>
+        </w:rPr>
+        <w:t xml:space="preserve">Esqueleto de la respuesta:</w:t>
+      </w:r>
+    </w:p>
+    <w:p>
+      <w:pPr>
+        <w:pStyle w:val="RecuadroEsqueleto"/>
+      </w:pPr>
+      <w:r>
+        <w:t xml:space="preserve">1. </w:t>
+      </w:r>
+      <w:r>
+        <w:rPr>
+          <w:b/>
+          <w:bCs/>
+        </w:rPr>
+        <w:t xml:space="preserve">Tesis:</w:t>
+      </w:r>
+      <w:r>
+        <w:t xml:space="preserve"> </w:t>
+      </w:r>
+      <w:r>
+        <w:t xml:space="preserve">la eutanasia enfrenta el derecho a decidir con la protección de la vida y de los vulnerables.</w:t>
+      </w:r>
+    </w:p>
+    <w:p>
+      <w:pPr>
+        <w:pStyle w:val="RecuadroEsqueleto"/>
+      </w:pPr>
+      <w:r>
+        <w:t xml:space="preserve">2. </w:t>
+      </w:r>
+      <w:r>
+        <w:rPr>
+          <w:b/>
+          <w:bCs/>
+        </w:rPr>
+        <w:t xml:space="preserve">Definición y tipos:</w:t>
+      </w:r>
+      <w:r>
+        <w:t xml:space="preserve"> </w:t>
+      </w:r>
+      <w:r>
+        <w:t xml:space="preserve">voluntaria/no voluntaria; activa/pasiva (Cátedra de Psicología Evolutiva, 2026i, diapositiva 22).</w:t>
+      </w:r>
+    </w:p>
+    <w:p>
+      <w:pPr>
+        <w:pStyle w:val="RecuadroEsqueleto"/>
+      </w:pPr>
+      <w:r>
+        <w:t xml:space="preserve">3. </w:t>
+      </w:r>
+      <w:r>
+        <w:rPr>
+          <w:b/>
+          <w:bCs/>
+        </w:rPr>
+        <w:t xml:space="preserve">A favor:</w:t>
+      </w:r>
+      <w:r>
+        <w:t xml:space="preserve"> </w:t>
+      </w:r>
+      <w:r>
+        <w:t xml:space="preserve">autonomía y dignidad; aliviar el sufrimiento; regular lo que ya ocurre (Papalia et al., 2009b, p. 512).</w:t>
+      </w:r>
+    </w:p>
+    <w:p>
+      <w:pPr>
+        <w:pStyle w:val="RecuadroEsqueleto"/>
+      </w:pPr>
+      <w:r>
+        <w:t xml:space="preserve">4. </w:t>
+      </w:r>
+      <w:r>
+        <w:rPr>
+          <w:b/>
+          <w:bCs/>
+        </w:rPr>
+        <w:t xml:space="preserve">En contra:</w:t>
+      </w:r>
+      <w:r>
+        <w:t xml:space="preserve"> </w:t>
+      </w:r>
+      <w:r>
+        <w:t xml:space="preserve">quitar una vida está mal; presión sobre los desventajados; mal diagnóstico; coerción y juicios (p. 513).</w:t>
+      </w:r>
+    </w:p>
+    <w:p>
+      <w:pPr>
+        <w:pStyle w:val="RecuadroEsqueleto"/>
+      </w:pPr>
+      <w:r>
+        <w:t xml:space="preserve">5. </w:t>
+      </w:r>
+      <w:r>
+        <w:rPr>
+          <w:b/>
+          <w:bCs/>
+        </w:rPr>
+        <w:t xml:space="preserve">Cierre:</w:t>
+      </w:r>
+      <w:r>
+        <w:t xml:space="preserve"> </w:t>
+      </w:r>
+      <w:r>
+        <w:t xml:space="preserve">los paliativos y el cuidado de la dignidad son una alternativa.</w:t>
+      </w:r>
+    </w:p>
+    <w:p>
+      <w:pPr>
+        <w:pStyle w:val="RecuadroAtencion"/>
+      </w:pPr>
+      <w:r>
+        <w:t xml:space="preserve">⚠</w:t>
+      </w:r>
+      <w:r>
+        <w:t xml:space="preserve"> </w:t>
+      </w:r>
+      <w:r>
+        <w:rPr>
+          <w:b/>
+          <w:bCs/>
+        </w:rPr>
+        <w:t xml:space="preserve">No confundir:</w:t>
       </w:r>
       <w:r>
         <w:t xml:space="preserve"> </w:t>
@@ -2156,25 +3405,13 @@
           <w:i/>
           <w:iCs/>
         </w:rPr>
-        <w:t xml:space="preserve">Falso.</w:t>
-      </w:r>
-      <w:r>
-        <w:t xml:space="preserve"> </w:t>
-      </w:r>
-      <w:r>
-        <w:t xml:space="preserve">Esa es la pena; el luto es el comportamiento culturalmente aceptado (p. 487).</w:t>
-      </w:r>
-    </w:p>
-    <w:p>
-      <w:pPr>
-        <w:pStyle w:val="BodyText"/>
-      </w:pPr>
-      <w:r>
-        <w:rPr>
-          <w:b/>
-          <w:bCs/>
-        </w:rPr>
-        <w:t xml:space="preserve">4) Pregunta abierta (máx. 7 renglones).</w:t>
+        <w:t xml:space="preserve">voluntaria/no voluntaria</w:t>
+      </w:r>
+      <w:r>
+        <w:t xml:space="preserve"> </w:t>
+      </w:r>
+      <w:r>
+        <w:t xml:space="preserve">(si se conoce o no la voluntad del paciente) con</w:t>
       </w:r>
       <w:r>
         <w:t xml:space="preserve"> </w:t>
@@ -2184,43 +3421,111 @@
           <w:i/>
           <w:iCs/>
         </w:rPr>
-        <w:t xml:space="preserve">¿Hay una forma «normal» de morir y de hacer el duelo?</w:t>
-      </w:r>
-    </w:p>
-    <w:p>
-      <w:pPr>
-        <w:pStyle w:val="BodyText"/>
-      </w:pPr>
+        <w:t xml:space="preserve">activa/pasiva</w:t>
+      </w:r>
+      <w:r>
+        <w:t xml:space="preserve"> </w:t>
+      </w:r>
+      <w:r>
+        <w:t xml:space="preserve">(si se actúa para causar la muerte o se omite el tratamiento): son dos ejes distintos (Cátedra de Psicología Evolutiva, 2026i, diapositiva 22).</w:t>
+      </w:r>
+    </w:p>
+    <w:p>
+      <w:r>
+        <w:pict>
+          <v:rect style="width:0;height:1.5pt" o:hralign="center" o:hrstd="t" o:hr="t"/>
+        </w:pict>
+      </w:r>
+    </w:p>
+    <w:bookmarkEnd w:id="17"/>
+    <w:bookmarkStart w:id="18" w:name="para-rendir-formato-del-parcial"/>
+    <w:p>
+      <w:pPr>
+        <w:pStyle w:val="Heading2"/>
+      </w:pPr>
+      <w:r>
+        <w:t xml:space="preserve">Para rendir (formato del parcial)</w:t>
+      </w:r>
+    </w:p>
+    <w:p>
+      <w:pPr>
+        <w:pStyle w:val="FirstParagraph"/>
+      </w:pPr>
+      <w:r>
+        <w:rPr>
+          <w:b/>
+          <w:bCs/>
+        </w:rPr>
+        <w:t xml:space="preserve">1) Opción múltiple.</w:t>
+      </w:r>
+      <w:r>
+        <w:t xml:space="preserve"> </w:t>
+      </w:r>
+      <w:r>
+        <w:t xml:space="preserve">La eutanasia</w:t>
+      </w:r>
+      <w:r>
+        <w:t xml:space="preserve"> </w:t>
+      </w:r>
+      <w:r>
+        <w:rPr>
+          <w:b/>
+          <w:bCs/>
+        </w:rPr>
+        <w:t xml:space="preserve">pasiva</w:t>
+      </w:r>
+      <w:r>
+        <w:t xml:space="preserve"> </w:t>
+      </w:r>
+      <w:r>
+        <w:t xml:space="preserve">consiste en: (a) un acto deliberado de causar la muerte sin sufrimiento; (b)</w:t>
+      </w:r>
+      <w:r>
+        <w:t xml:space="preserve"> </w:t>
+      </w:r>
+      <w:r>
+        <w:rPr>
+          <w:b/>
+          <w:bCs/>
+        </w:rPr>
+        <w:t xml:space="preserve">la muerte por omisión intencional de una acción médica que garantizaría prolongar la vida</w:t>
+      </w:r>
+      <w:r>
+        <w:t xml:space="preserve">; (c) aliviar el dolor del paciente terminal; (d) actuar sin conocer la voluntad del paciente. —</w:t>
+      </w:r>
+      <w:r>
+        <w:t xml:space="preserve"> </w:t>
+      </w:r>
       <w:r>
         <w:rPr>
           <w:i/>
           <w:iCs/>
         </w:rPr>
-        <w:t xml:space="preserve">Respuesta modelo:</w:t>
-      </w:r>
-      <w:r>
-        <w:t xml:space="preserve"> </w:t>
-      </w:r>
-      <w:r>
-        <w:t xml:space="preserve">No hay una forma única. Kübler-Ross describió cinco reacciones ante la muerte cercana (negación, ira, negociación, depresión y aceptación), pero no son verdaderas etapas: no todos pasan por ellas ni en ese orden, y no deben usarse como criterio de un «buen morir». En el duelo, Wortman y Silver desmintieron mitos como que todos se deprimen o que hay que «trabajar» la pérdida, y el estudio CLOC halló que lo más frecuente en los viudos mayores es la resiliencia (46 %), mientras que el duelo clásico es raro (11 %) (Papalia et al., 2009b, pp. 487, 493-496).</w:t>
-      </w:r>
-    </w:p>
-    <w:bookmarkEnd w:id="14"/>
-    <w:bookmarkStart w:id="15" w:name="referencias"/>
-    <w:p>
-      <w:pPr>
-        <w:pStyle w:val="Heading2"/>
-      </w:pPr>
-      <w:r>
-        <w:t xml:space="preserve">Referencias</w:t>
-      </w:r>
-    </w:p>
-    <w:p>
-      <w:pPr>
-        <w:pStyle w:val="FirstParagraph"/>
-      </w:pPr>
-      <w:r>
-        <w:t xml:space="preserve">Papalia, D. E., Sterns, H. L., Feldman, R. D., &amp; Camp, C. J. (2009b). Lidiar con la muerte y las pérdidas. En</w:t>
+        <w:t xml:space="preserve">Respuesta: b.</w:t>
+      </w:r>
+      <w:r>
+        <w:t xml:space="preserve"> </w:t>
+      </w:r>
+      <w:r>
+        <w:t xml:space="preserve">La (a) es la activa; la (c), cuidados paliativos; la (d), la eutanasia no voluntaria (Cátedra de Psicología Evolutiva, 2026i, diapositiva 22).</w:t>
+      </w:r>
+    </w:p>
+    <w:p>
+      <w:pPr>
+        <w:pStyle w:val="BodyText"/>
+      </w:pPr>
+      <w:r>
+        <w:rPr>
+          <w:b/>
+          <w:bCs/>
+        </w:rPr>
+        <w:t xml:space="preserve">2) Verdadero o falso.</w:t>
+      </w:r>
+      <w:r>
+        <w:t xml:space="preserve"> </w:t>
+      </w:r>
+      <w:r>
+        <w:t xml:space="preserve">«La caída terminal solo afecta habilidades que ya declinan con la edad.» —</w:t>
       </w:r>
       <w:r>
         <w:t xml:space="preserve"> </w:t>
@@ -2230,6 +3535,150 @@
           <w:i/>
           <w:iCs/>
         </w:rPr>
+        <w:t xml:space="preserve">Falso.</w:t>
+      </w:r>
+      <w:r>
+        <w:t xml:space="preserve"> </w:t>
+      </w:r>
+      <w:r>
+        <w:t xml:space="preserve">Afecta también habilidades relativamente conservadas, como el vocabulario, y opera sin importar la salud, el género o la causa de muerte (Cátedra de Psicología Evolutiva, 2026i, diapositivas 12-13).</w:t>
+      </w:r>
+    </w:p>
+    <w:p>
+      <w:pPr>
+        <w:pStyle w:val="BodyText"/>
+      </w:pPr>
+      <w:r>
+        <w:rPr>
+          <w:b/>
+          <w:bCs/>
+        </w:rPr>
+        <w:t xml:space="preserve">3) Verdadero o falso.</w:t>
+      </w:r>
+      <w:r>
+        <w:t xml:space="preserve"> </w:t>
+      </w:r>
+      <w:r>
+        <w:t xml:space="preserve">«Según Wortman y Silver, todo el que sufre una pérdida severa se deprime y debe</w:t>
+      </w:r>
+      <w:r>
+        <w:t xml:space="preserve"> </w:t>
+      </w:r>
+      <w:r>
+        <w:t xml:space="preserve">“trabajar”</w:t>
+      </w:r>
+      <w:r>
+        <w:t xml:space="preserve"> </w:t>
+      </w:r>
+      <w:r>
+        <w:t xml:space="preserve">el duelo.» —</w:t>
+      </w:r>
+      <w:r>
+        <w:t xml:space="preserve"> </w:t>
+      </w:r>
+      <w:r>
+        <w:rPr>
+          <w:i/>
+          <w:iCs/>
+        </w:rPr>
+        <w:t xml:space="preserve">Falso.</w:t>
+      </w:r>
+      <w:r>
+        <w:t xml:space="preserve"> </w:t>
+      </w:r>
+      <w:r>
+        <w:t xml:space="preserve">Esas son dos de las cinco creencias que resultaron más mito que realidad (Papalia et al., 2009b, pp. 493-494).</w:t>
+      </w:r>
+    </w:p>
+    <w:p>
+      <w:pPr>
+        <w:pStyle w:val="BodyText"/>
+      </w:pPr>
+      <w:r>
+        <w:rPr>
+          <w:b/>
+          <w:bCs/>
+        </w:rPr>
+        <w:t xml:space="preserve">4) Pregunta abierta (máx. 7 renglones).</w:t>
+      </w:r>
+      <w:r>
+        <w:t xml:space="preserve"> </w:t>
+      </w:r>
+      <w:r>
+        <w:rPr>
+          <w:i/>
+          <w:iCs/>
+        </w:rPr>
+        <w:t xml:space="preserve">Compará las actitudes hacia la muerte en la adultez joven, media y tardía.</w:t>
+      </w:r>
+    </w:p>
+    <w:p>
+      <w:pPr>
+        <w:pStyle w:val="BodyText"/>
+      </w:pPr>
+      <w:r>
+        <w:rPr>
+          <w:i/>
+          <w:iCs/>
+        </w:rPr>
+        <w:t xml:space="preserve">Respuesta modelo:</w:t>
+      </w:r>
+      <w:r>
+        <w:t xml:space="preserve"> </w:t>
+      </w:r>
+      <w:r>
+        <w:t xml:space="preserve">Los adultos jóvenes evitan pensar en la muerte y los adolescentes asumen riesgos por la fábula personal, que desaparece al tomar responsabilidades laborales y familiares. En la adultez media se empieza a comprender que se va a morir, sobre todo por la muerte de los padres y la conciencia de ser la «generación más vieja»; cambia la percepción del tiempo (cuántos años quedan) y se reanalizan carreras, matrimonios y valores. Los ancianos están en general menos ansiosos, usan estrategias centradas en la emoción y reorganizan sus pensamientos para aceptar su mortalidad (Papalia et al., 2009b, pp. 483-484).</w:t>
+      </w:r>
+    </w:p>
+    <w:bookmarkEnd w:id="18"/>
+    <w:bookmarkStart w:id="19" w:name="referencias"/>
+    <w:p>
+      <w:pPr>
+        <w:pStyle w:val="Heading2"/>
+      </w:pPr>
+      <w:r>
+        <w:t xml:space="preserve">Referencias</w:t>
+      </w:r>
+    </w:p>
+    <w:p>
+      <w:pPr>
+        <w:pStyle w:val="FirstParagraph"/>
+      </w:pPr>
+      <w:r>
+        <w:t xml:space="preserve">Cátedra de Psicología Evolutiva. (2026i).</w:t>
+      </w:r>
+      <w:r>
+        <w:t xml:space="preserve"> </w:t>
+      </w:r>
+      <w:r>
+        <w:rPr>
+          <w:i/>
+          <w:iCs/>
+        </w:rPr>
+        <w:t xml:space="preserve">Actitudes y creencias frente a la muerte</w:t>
+      </w:r>
+      <w:r>
+        <w:t xml:space="preserve"> </w:t>
+      </w:r>
+      <w:r>
+        <w:t xml:space="preserve">[Diapositivas de clase, unidad 10]. Universidad Favaloro.</w:t>
+      </w:r>
+    </w:p>
+    <w:p>
+      <w:pPr>
+        <w:pStyle w:val="BodyText"/>
+      </w:pPr>
+      <w:r>
+        <w:t xml:space="preserve">Papalia, D. E., Sterns, H. L., Feldman, R. D., &amp; Camp, C. J. (2009b). Lidiar con la muerte y las pérdidas. En</w:t>
+      </w:r>
+      <w:r>
+        <w:t xml:space="preserve"> </w:t>
+      </w:r>
+      <w:r>
+        <w:rPr>
+          <w:i/>
+          <w:iCs/>
+        </w:rPr>
         <w:t xml:space="preserve">Desarrollo del adulto y vejez</w:t>
       </w:r>
       <w:r>
@@ -2239,8 +3688,8 @@
         <w:t xml:space="preserve">(cap. 13, pp. 476-521). McGraw Hill Interamericana.</w:t>
       </w:r>
     </w:p>
-    <w:bookmarkEnd w:id="15"/>
-    <w:bookmarkEnd w:id="16"/>
+    <w:bookmarkEnd w:id="19"/>
+    <w:bookmarkEnd w:id="20"/>
     <w:sectPr>
       <w:headerReference r:id="rIdHdr1" w:type="default"/>
       <w:footerReference r:id="rIdFtr1" w:type="default"/>
@@ -2324,7 +3773,7 @@
       <w:pStyle w:val="EncabezadoGuia"/>
     </w:pPr>
     <w:r>
-      <w:t xml:space="preserve">C23 — Muerte y duelo · Versión de cursada</w:t>
+      <w:t xml:space="preserve">C23 — Actitudes y creencias frente a la muerte · Versión de cursada</w:t>
     </w:r>
   </w:p>
 </w:hdr>
@@ -2606,6 +4055,12 @@
     <w:abstractNumId w:val="991"/>
   </w:num>
   <w:num w:numId="1003">
+    <w:abstractNumId w:val="991"/>
+  </w:num>
+  <w:num w:numId="1004">
+    <w:abstractNumId w:val="991"/>
+  </w:num>
+  <w:num w:numId="1005">
     <w:abstractNumId w:val="99411"/>
     <w:lvlOverride w:ilvl="0">
       <w:startOverride w:val="1"/>
@@ -2635,10 +4090,40 @@
       <w:startOverride w:val="1"/>
     </w:lvlOverride>
   </w:num>
-  <w:num w:numId="1004">
+  <w:num w:numId="1006">
+    <w:abstractNumId w:val="99411"/>
+    <w:lvlOverride w:ilvl="0">
+      <w:startOverride w:val="1"/>
+    </w:lvlOverride>
+    <w:lvlOverride w:ilvl="1">
+      <w:startOverride w:val="1"/>
+    </w:lvlOverride>
+    <w:lvlOverride w:ilvl="2">
+      <w:startOverride w:val="1"/>
+    </w:lvlOverride>
+    <w:lvlOverride w:ilvl="3">
+      <w:startOverride w:val="1"/>
+    </w:lvlOverride>
+    <w:lvlOverride w:ilvl="4">
+      <w:startOverride w:val="1"/>
+    </w:lvlOverride>
+    <w:lvlOverride w:ilvl="5">
+      <w:startOverride w:val="1"/>
+    </w:lvlOverride>
+    <w:lvlOverride w:ilvl="6">
+      <w:startOverride w:val="1"/>
+    </w:lvlOverride>
+    <w:lvlOverride w:ilvl="7">
+      <w:startOverride w:val="1"/>
+    </w:lvlOverride>
+    <w:lvlOverride w:ilvl="8">
+      <w:startOverride w:val="1"/>
+    </w:lvlOverride>
+  </w:num>
+  <w:num w:numId="1007">
     <w:abstractNumId w:val="991"/>
   </w:num>
-  <w:num w:numId="1005">
+  <w:num w:numId="1008">
     <w:abstractNumId w:val="991"/>
   </w:num>
 </w:numbering>

</xml_diff>